<commit_message>
SEQUOIADBMAINSTREAM-3925 【story】SequoiaDB支持Amazon S3接口 -HEAD接口
git-svn-id: http://192.168.20.11/sequoiadb/trunk@37633 6121f079-4a18-41d3-8c30-8870a322f2c2
</commit_message>
<xml_diff>
--- a/internal_doc/03.开发设计/Amazon S3接口兼容/Story--SequoiaDB兼容Amazon S3接口 -桶管理.docx
+++ b/internal_doc/03.开发设计/Amazon S3接口兼容/Story--SequoiaDB兼容Amazon S3接口 -桶管理.docx
@@ -6,7 +6,6 @@
       <w:pPr>
         <w:pStyle w:val="ab"/>
       </w:pPr>
-      <w:proofErr w:type="spellStart"/>
       <w:r>
         <w:rPr>
           <w:rFonts w:hint="eastAsia"/>
@@ -16,7 +15,6 @@
       <w:r>
         <w:t>equoiaDB</w:t>
       </w:r>
-      <w:proofErr w:type="spellEnd"/>
       <w:r>
         <w:rPr>
           <w:rFonts w:hint="eastAsia"/>
@@ -140,7 +138,6 @@
               </w:rPr>
               <w:t>继承自</w:t>
             </w:r>
-            <w:proofErr w:type="spellStart"/>
             <w:r>
               <w:rPr>
                 <w:rFonts w:hint="eastAsia"/>
@@ -150,7 +147,6 @@
             <w:r>
               <w:t>equoiaDB</w:t>
             </w:r>
-            <w:proofErr w:type="spellEnd"/>
             <w:r>
               <w:rPr>
                 <w:rFonts w:hint="eastAsia"/>
@@ -396,7 +392,6 @@
         </w:rPr>
         <w:t>接口访问</w:t>
       </w:r>
-      <w:proofErr w:type="spellStart"/>
       <w:r>
         <w:rPr>
           <w:rFonts w:hint="eastAsia"/>
@@ -404,7 +399,6 @@
         </w:rPr>
         <w:t>SequoiaDB</w:t>
       </w:r>
-      <w:proofErr w:type="spellEnd"/>
       <w:r>
         <w:rPr>
           <w:rFonts w:hint="eastAsia"/>
@@ -447,7 +441,6 @@
         </w:rPr>
         <w:t>通过</w:t>
       </w:r>
-      <w:proofErr w:type="spellStart"/>
       <w:r>
         <w:rPr>
           <w:rFonts w:hint="eastAsia"/>
@@ -455,7 +448,6 @@
         </w:rPr>
         <w:t>SequoiaDB</w:t>
       </w:r>
-      <w:proofErr w:type="spellEnd"/>
       <w:r>
         <w:rPr>
           <w:rFonts w:hint="eastAsia"/>
@@ -492,21 +484,12 @@
           <w:color w:val="000000" w:themeColor="text1"/>
         </w:rPr>
       </w:pPr>
-      <w:proofErr w:type="gramStart"/>
       <w:r>
         <w:rPr>
           <w:rFonts w:hint="eastAsia"/>
           <w:color w:val="000000" w:themeColor="text1"/>
         </w:rPr>
-        <w:t>桶管理</w:t>
-      </w:r>
-      <w:proofErr w:type="gramEnd"/>
-      <w:r>
-        <w:rPr>
-          <w:rFonts w:hint="eastAsia"/>
-          <w:color w:val="000000" w:themeColor="text1"/>
-        </w:rPr>
-        <w:t>部分描述桶的增加</w:t>
+        <w:t>桶管理部分描述桶的增加</w:t>
       </w:r>
       <w:r>
         <w:rPr>
@@ -662,35 +645,15 @@
         </w:rPr>
         <w:t>，参考</w:t>
       </w:r>
-      <w:r>
-        <w:fldChar w:fldCharType="begin"/>
-      </w:r>
-      <w:r>
-        <w:instrText xml:space="preserve"> HYPERLINK \l "_</w:instrText>
-      </w:r>
-      <w:r>
-        <w:instrText>公共头部</w:instrText>
-      </w:r>
-      <w:r>
-        <w:instrText xml:space="preserve">" </w:instrText>
-      </w:r>
-      <w:r>
-        <w:fldChar w:fldCharType="separate"/>
-      </w:r>
-      <w:r>
-        <w:rPr>
-          <w:rStyle w:val="ad"/>
-          <w:rFonts w:cstheme="minorHAnsi"/>
-        </w:rPr>
-        <w:t>公共头部</w:t>
-      </w:r>
-      <w:r>
-        <w:rPr>
-          <w:rStyle w:val="ad"/>
-          <w:rFonts w:cstheme="minorHAnsi"/>
-        </w:rPr>
-        <w:fldChar w:fldCharType="end"/>
-      </w:r>
+      <w:hyperlink w:anchor="_公共头部" w:history="1">
+        <w:r>
+          <w:rPr>
+            <w:rStyle w:val="ad"/>
+            <w:rFonts w:cstheme="minorHAnsi"/>
+          </w:rPr>
+          <w:t>公共头部</w:t>
+        </w:r>
+      </w:hyperlink>
       <w:r>
         <w:rPr>
           <w:rFonts w:cstheme="minorHAnsi"/>
@@ -916,14 +879,12 @@
                 <w:rFonts w:cstheme="minorHAnsi"/>
               </w:rPr>
             </w:pPr>
-            <w:proofErr w:type="spellStart"/>
             <w:r>
               <w:rPr>
                 <w:rFonts w:cstheme="minorHAnsi"/>
               </w:rPr>
               <w:t>ListAllMyBucketsResult</w:t>
             </w:r>
-            <w:proofErr w:type="spellEnd"/>
           </w:p>
         </w:tc>
         <w:tc>
@@ -1042,16 +1003,8 @@
               <w:rPr>
                 <w:rFonts w:cstheme="minorHAnsi"/>
               </w:rPr>
-              <w:t xml:space="preserve">Ancestor: </w:t>
-            </w:r>
-            <w:proofErr w:type="spellStart"/>
-            <w:r>
-              <w:rPr>
-                <w:rFonts w:cstheme="minorHAnsi"/>
-              </w:rPr>
-              <w:t>ListAllMyBucketsResult</w:t>
-            </w:r>
-            <w:proofErr w:type="spellEnd"/>
+              <w:t>Ancestor: ListAllMyBucketsResult</w:t>
+            </w:r>
           </w:p>
         </w:tc>
       </w:tr>
@@ -1121,16 +1074,8 @@
               <w:rPr>
                 <w:rFonts w:cstheme="minorHAnsi"/>
               </w:rPr>
-              <w:t xml:space="preserve">Ancestor: </w:t>
-            </w:r>
-            <w:proofErr w:type="spellStart"/>
-            <w:r>
-              <w:rPr>
-                <w:rFonts w:cstheme="minorHAnsi"/>
-              </w:rPr>
-              <w:t>ListAllMyBucketsResult.Owner</w:t>
-            </w:r>
-            <w:proofErr w:type="spellEnd"/>
+              <w:t>Ancestor: ListAllMyBucketsResult.Owner</w:t>
+            </w:r>
           </w:p>
         </w:tc>
       </w:tr>
@@ -1149,14 +1094,12 @@
                 <w:rFonts w:cstheme="minorHAnsi"/>
               </w:rPr>
             </w:pPr>
-            <w:proofErr w:type="spellStart"/>
             <w:r>
               <w:rPr>
                 <w:rFonts w:cstheme="minorHAnsi"/>
               </w:rPr>
               <w:t>DisplayName</w:t>
             </w:r>
-            <w:proofErr w:type="spellEnd"/>
           </w:p>
         </w:tc>
         <w:tc>
@@ -1202,16 +1145,8 @@
               <w:rPr>
                 <w:rFonts w:cstheme="minorHAnsi"/>
               </w:rPr>
-              <w:t xml:space="preserve">Ancestor: </w:t>
-            </w:r>
-            <w:proofErr w:type="spellStart"/>
-            <w:r>
-              <w:rPr>
-                <w:rFonts w:cstheme="minorHAnsi"/>
-              </w:rPr>
-              <w:t>ListAllMyBucketsResult.Owner</w:t>
-            </w:r>
-            <w:proofErr w:type="spellEnd"/>
+              <w:t>Ancestor: ListAllMyBucketsResult.Owner</w:t>
+            </w:r>
           </w:p>
         </w:tc>
       </w:tr>
@@ -1295,16 +1230,8 @@
               <w:rPr>
                 <w:rFonts w:cstheme="minorHAnsi"/>
               </w:rPr>
-              <w:t xml:space="preserve">Ancestor: </w:t>
-            </w:r>
-            <w:proofErr w:type="spellStart"/>
-            <w:r>
-              <w:rPr>
-                <w:rFonts w:cstheme="minorHAnsi"/>
-              </w:rPr>
-              <w:t>ListAllMyBucketsResult</w:t>
-            </w:r>
-            <w:proofErr w:type="spellEnd"/>
+              <w:t>Ancestor: ListAllMyBucketsResult</w:t>
+            </w:r>
           </w:p>
         </w:tc>
       </w:tr>
@@ -1371,38 +1298,22 @@
               <w:rPr>
                 <w:rFonts w:cstheme="minorHAnsi"/>
               </w:rPr>
-              <w:t xml:space="preserve">Children: Name, </w:t>
-            </w:r>
-            <w:proofErr w:type="spellStart"/>
-            <w:r>
+              <w:t>Children: Name, CreationDate</w:t>
+            </w:r>
+          </w:p>
+          <w:p>
+            <w:pPr>
+              <w:ind w:left="0"/>
               <w:rPr>
                 <w:rFonts w:cstheme="minorHAnsi"/>
               </w:rPr>
-              <w:t>CreationDate</w:t>
-            </w:r>
-            <w:proofErr w:type="spellEnd"/>
-          </w:p>
-          <w:p>
-            <w:pPr>
-              <w:ind w:left="0"/>
+            </w:pPr>
+            <w:r>
               <w:rPr>
                 <w:rFonts w:cstheme="minorHAnsi"/>
               </w:rPr>
-            </w:pPr>
-            <w:r>
-              <w:rPr>
-                <w:rFonts w:cstheme="minorHAnsi"/>
-              </w:rPr>
-              <w:t xml:space="preserve">Ancestor: </w:t>
-            </w:r>
-            <w:proofErr w:type="spellStart"/>
-            <w:r>
-              <w:rPr>
-                <w:rFonts w:cstheme="minorHAnsi"/>
-              </w:rPr>
-              <w:t>ListAllMyBucketsResult.Bucket</w:t>
-            </w:r>
-            <w:proofErr w:type="spellEnd"/>
+              <w:t>Ancestor: ListAllMyBucketsResult.Bucket</w:t>
+            </w:r>
           </w:p>
         </w:tc>
       </w:tr>
@@ -1469,16 +1380,8 @@
               <w:rPr>
                 <w:rFonts w:cstheme="minorHAnsi"/>
               </w:rPr>
-              <w:t xml:space="preserve">Ancestor: </w:t>
-            </w:r>
-            <w:proofErr w:type="spellStart"/>
-            <w:r>
-              <w:rPr>
-                <w:rFonts w:cstheme="minorHAnsi"/>
-              </w:rPr>
-              <w:t>ListAllMyBucketsResult.Buckets.Bucket</w:t>
-            </w:r>
-            <w:proofErr w:type="spellEnd"/>
+              <w:t>Ancestor: ListAllMyBucketsResult.Buckets.Bucket</w:t>
+            </w:r>
           </w:p>
         </w:tc>
       </w:tr>
@@ -1494,14 +1397,12 @@
                 <w:rFonts w:cstheme="minorHAnsi"/>
               </w:rPr>
             </w:pPr>
-            <w:proofErr w:type="spellStart"/>
             <w:r>
               <w:rPr>
                 <w:rFonts w:cstheme="minorHAnsi"/>
               </w:rPr>
               <w:t>CreationDate</w:t>
             </w:r>
-            <w:proofErr w:type="spellEnd"/>
           </w:p>
         </w:tc>
         <w:tc>
@@ -1533,58 +1434,22 @@
               <w:rPr>
                 <w:rFonts w:cstheme="minorHAnsi"/>
               </w:rPr>
-              <w:t xml:space="preserve">Type: date (of the form </w:t>
-            </w:r>
-            <w:proofErr w:type="spellStart"/>
-            <w:r>
+              <w:t>Type: date (of the form yyyy-mm-ddThh:mm:ss.timezone, e.g., 2009-02-03T16:45:09.000Z)</w:t>
+            </w:r>
+          </w:p>
+          <w:p>
+            <w:pPr>
+              <w:ind w:left="0"/>
               <w:rPr>
                 <w:rFonts w:cstheme="minorHAnsi"/>
               </w:rPr>
-              <w:t>yyyy-mm-ddThh:</w:t>
-            </w:r>
-            <w:proofErr w:type="gramStart"/>
+            </w:pPr>
             <w:r>
               <w:rPr>
                 <w:rFonts w:cstheme="minorHAnsi"/>
               </w:rPr>
-              <w:t>mm:ss</w:t>
-            </w:r>
-            <w:proofErr w:type="gramEnd"/>
-            <w:r>
-              <w:rPr>
-                <w:rFonts w:cstheme="minorHAnsi"/>
-              </w:rPr>
-              <w:t>.timezone</w:t>
-            </w:r>
-            <w:proofErr w:type="spellEnd"/>
-            <w:r>
-              <w:rPr>
-                <w:rFonts w:cstheme="minorHAnsi"/>
-              </w:rPr>
-              <w:t>, e.g., 2009-02-03T16:45:09.000Z)</w:t>
-            </w:r>
-          </w:p>
-          <w:p>
-            <w:pPr>
-              <w:ind w:left="0"/>
-              <w:rPr>
-                <w:rFonts w:cstheme="minorHAnsi"/>
-              </w:rPr>
-            </w:pPr>
-            <w:r>
-              <w:rPr>
-                <w:rFonts w:cstheme="minorHAnsi"/>
-              </w:rPr>
-              <w:t xml:space="preserve">Ancestor: </w:t>
-            </w:r>
-            <w:proofErr w:type="spellStart"/>
-            <w:r>
-              <w:rPr>
-                <w:rFonts w:cstheme="minorHAnsi"/>
-              </w:rPr>
-              <w:t>ListAllMyBucketsResult.Buckets.Bucket</w:t>
-            </w:r>
-            <w:proofErr w:type="spellEnd"/>
+              <w:t>Ancestor: ListAllMyBucketsResult.Buckets.Bucket</w:t>
+            </w:r>
           </w:p>
         </w:tc>
       </w:tr>
@@ -1639,421 +1504,268 @@
                 <w:i/>
               </w:rPr>
             </w:pPr>
-            <w:proofErr w:type="gramStart"/>
             <w:r>
               <w:rPr>
                 <w:rFonts w:cstheme="minorHAnsi"/>
                 <w:i/>
               </w:rPr>
-              <w:t>&lt;?xml</w:t>
-            </w:r>
-            <w:proofErr w:type="gramEnd"/>
-            <w:r>
+              <w:t xml:space="preserve">&lt;?xml version="1.0" encoding="UTF-8"?&gt; </w:t>
+            </w:r>
+          </w:p>
+          <w:p>
+            <w:pPr>
+              <w:ind w:left="420" w:hangingChars="200" w:hanging="420"/>
               <w:rPr>
                 <w:rFonts w:cstheme="minorHAnsi"/>
                 <w:i/>
               </w:rPr>
-              <w:t xml:space="preserve"> version="1.0" encoding="UTF-8"?&gt; </w:t>
-            </w:r>
-          </w:p>
-          <w:p>
-            <w:pPr>
-              <w:ind w:left="420" w:hangingChars="200" w:hanging="420"/>
+            </w:pPr>
+            <w:r>
               <w:rPr>
                 <w:rFonts w:cstheme="minorHAnsi"/>
                 <w:i/>
               </w:rPr>
-            </w:pPr>
-            <w:r>
+              <w:t>&lt;ListAllMyBucketsResult&gt;</w:t>
+            </w:r>
+          </w:p>
+          <w:p>
+            <w:pPr>
+              <w:ind w:leftChars="100" w:left="420" w:hangingChars="100" w:hanging="210"/>
               <w:rPr>
                 <w:rFonts w:cstheme="minorHAnsi"/>
                 <w:i/>
               </w:rPr>
-              <w:t>&lt;</w:t>
-            </w:r>
-            <w:proofErr w:type="spellStart"/>
+            </w:pPr>
             <w:r>
               <w:rPr>
                 <w:rFonts w:cstheme="minorHAnsi"/>
                 <w:i/>
               </w:rPr>
-              <w:t>ListAllMyBucketsResult</w:t>
-            </w:r>
-            <w:proofErr w:type="spellEnd"/>
-            <w:r>
+              <w:t xml:space="preserve">  &lt;Owner&gt;  </w:t>
+            </w:r>
+          </w:p>
+          <w:p>
+            <w:pPr>
+              <w:ind w:left="630" w:hangingChars="300" w:hanging="630"/>
               <w:rPr>
                 <w:rFonts w:cstheme="minorHAnsi"/>
                 <w:i/>
               </w:rPr>
-              <w:t>&gt;</w:t>
-            </w:r>
-          </w:p>
-          <w:p>
-            <w:pPr>
-              <w:ind w:leftChars="100" w:left="420" w:hangingChars="100" w:hanging="210"/>
+            </w:pPr>
+            <w:r>
               <w:rPr>
                 <w:rFonts w:cstheme="minorHAnsi"/>
                 <w:i/>
               </w:rPr>
-            </w:pPr>
-            <w:r>
+              <w:t xml:space="preserve">      &lt;ID&gt;bcaf1ffd86f461ca5fb16fd081034f&lt;/ID&gt;  </w:t>
+            </w:r>
+          </w:p>
+          <w:p>
+            <w:pPr>
+              <w:ind w:leftChars="200" w:left="630" w:hangingChars="100" w:hanging="210"/>
               <w:rPr>
                 <w:rFonts w:cstheme="minorHAnsi"/>
                 <w:i/>
               </w:rPr>
-              <w:t xml:space="preserve">  &lt;Owner&gt;  </w:t>
-            </w:r>
-          </w:p>
-          <w:p>
-            <w:pPr>
-              <w:ind w:left="630" w:hangingChars="300" w:hanging="630"/>
+            </w:pPr>
+            <w:r>
               <w:rPr>
                 <w:rFonts w:cstheme="minorHAnsi"/>
                 <w:i/>
               </w:rPr>
-            </w:pPr>
-            <w:r>
+              <w:t xml:space="preserve">  &lt;DisplayName&gt;webfile&lt;/DisplayName&gt;  </w:t>
+            </w:r>
+          </w:p>
+          <w:p>
+            <w:pPr>
+              <w:ind w:leftChars="100" w:left="210" w:firstLineChars="100" w:firstLine="210"/>
               <w:rPr>
                 <w:rFonts w:cstheme="minorHAnsi"/>
                 <w:i/>
               </w:rPr>
-              <w:t xml:space="preserve">      &lt;ID&gt;bcaf1ffd86f461ca5fb16fd081034f&lt;/ID&gt;  </w:t>
-            </w:r>
-          </w:p>
-          <w:p>
-            <w:pPr>
-              <w:ind w:leftChars="200" w:left="630" w:hangingChars="100" w:hanging="210"/>
+            </w:pPr>
+            <w:r>
               <w:rPr>
                 <w:rFonts w:cstheme="minorHAnsi"/>
                 <w:i/>
               </w:rPr>
-            </w:pPr>
-            <w:r>
+              <w:t xml:space="preserve">&lt;/Owner&gt;  </w:t>
+            </w:r>
+          </w:p>
+          <w:p>
+            <w:pPr>
+              <w:ind w:left="0" w:firstLineChars="200" w:firstLine="420"/>
               <w:rPr>
                 <w:rFonts w:cstheme="minorHAnsi"/>
                 <w:i/>
               </w:rPr>
-              <w:t xml:space="preserve">  &lt;</w:t>
-            </w:r>
-            <w:proofErr w:type="spellStart"/>
+            </w:pPr>
             <w:r>
               <w:rPr>
                 <w:rFonts w:cstheme="minorHAnsi"/>
                 <w:i/>
               </w:rPr>
-              <w:t>DisplayName</w:t>
-            </w:r>
-            <w:proofErr w:type="spellEnd"/>
-            <w:r>
+              <w:t>&lt;Buckets&gt;</w:t>
+            </w:r>
+          </w:p>
+          <w:p>
+            <w:pPr>
+              <w:ind w:left="0" w:firstLineChars="400" w:firstLine="840"/>
               <w:rPr>
                 <w:rFonts w:cstheme="minorHAnsi"/>
                 <w:i/>
               </w:rPr>
-              <w:t>&gt;</w:t>
-            </w:r>
-            <w:proofErr w:type="spellStart"/>
+            </w:pPr>
             <w:r>
               <w:rPr>
                 <w:rFonts w:cstheme="minorHAnsi"/>
                 <w:i/>
               </w:rPr>
-              <w:t>webfile</w:t>
-            </w:r>
-            <w:proofErr w:type="spellEnd"/>
-            <w:r>
+              <w:t>&lt;Bucket&gt;</w:t>
+            </w:r>
+          </w:p>
+          <w:p>
+            <w:pPr>
+              <w:ind w:left="0" w:firstLine="420"/>
               <w:rPr>
                 <w:rFonts w:cstheme="minorHAnsi"/>
                 <w:i/>
               </w:rPr>
-              <w:t>&lt;/</w:t>
-            </w:r>
-            <w:proofErr w:type="spellStart"/>
+            </w:pPr>
             <w:r>
               <w:rPr>
                 <w:rFonts w:cstheme="minorHAnsi"/>
                 <w:i/>
               </w:rPr>
-              <w:t>DisplayName</w:t>
-            </w:r>
-            <w:proofErr w:type="spellEnd"/>
-            <w:r>
+              <w:t xml:space="preserve">      &lt;Name&gt;quotes&lt;/Name&gt;   </w:t>
+            </w:r>
+          </w:p>
+          <w:p>
+            <w:pPr>
+              <w:ind w:leftChars="300" w:left="840" w:hangingChars="100" w:hanging="210"/>
               <w:rPr>
                 <w:rFonts w:cstheme="minorHAnsi"/>
                 <w:i/>
               </w:rPr>
-              <w:t xml:space="preserve">&gt;  </w:t>
-            </w:r>
-          </w:p>
-          <w:p>
-            <w:pPr>
-              <w:ind w:leftChars="100" w:left="210" w:firstLineChars="100" w:firstLine="210"/>
+            </w:pPr>
+            <w:r>
               <w:rPr>
                 <w:rFonts w:cstheme="minorHAnsi"/>
                 <w:i/>
               </w:rPr>
-            </w:pPr>
-            <w:r>
+              <w:t xml:space="preserve">   &lt;CreationDate&gt;2006-02-03T16:45:09.000Z&lt;/CreationDate&gt;  </w:t>
+            </w:r>
+          </w:p>
+          <w:p>
+            <w:pPr>
+              <w:ind w:leftChars="300" w:left="840" w:hangingChars="100" w:hanging="210"/>
               <w:rPr>
                 <w:rFonts w:cstheme="minorHAnsi"/>
                 <w:i/>
               </w:rPr>
-              <w:t xml:space="preserve">&lt;/Owner&gt;  </w:t>
-            </w:r>
-          </w:p>
-          <w:p>
-            <w:pPr>
-              <w:ind w:left="0" w:firstLineChars="200" w:firstLine="420"/>
+            </w:pPr>
+            <w:r>
               <w:rPr>
                 <w:rFonts w:cstheme="minorHAnsi"/>
                 <w:i/>
               </w:rPr>
-            </w:pPr>
-            <w:r>
+              <w:t xml:space="preserve">  &lt;/Bucket&gt;  </w:t>
+            </w:r>
+          </w:p>
+          <w:p>
+            <w:pPr>
+              <w:ind w:left="0" w:firstLineChars="100" w:firstLine="210"/>
               <w:rPr>
                 <w:rFonts w:cstheme="minorHAnsi"/>
                 <w:i/>
               </w:rPr>
-              <w:t>&lt;Buckets&gt;</w:t>
-            </w:r>
-          </w:p>
-          <w:p>
-            <w:pPr>
-              <w:ind w:left="0" w:firstLineChars="400" w:firstLine="840"/>
+            </w:pPr>
+            <w:r>
               <w:rPr>
                 <w:rFonts w:cstheme="minorHAnsi"/>
                 <w:i/>
               </w:rPr>
-            </w:pPr>
-            <w:r>
+              <w:t xml:space="preserve">      &lt;Bucket&gt;</w:t>
+            </w:r>
+          </w:p>
+          <w:p>
+            <w:pPr>
+              <w:ind w:left="0" w:firstLineChars="200" w:firstLine="420"/>
               <w:rPr>
                 <w:rFonts w:cstheme="minorHAnsi"/>
                 <w:i/>
               </w:rPr>
-              <w:t>&lt;Bucket&gt;</w:t>
-            </w:r>
-          </w:p>
-          <w:p>
-            <w:pPr>
-              <w:ind w:left="0" w:firstLine="420"/>
+            </w:pPr>
+            <w:r>
               <w:rPr>
                 <w:rFonts w:cstheme="minorHAnsi"/>
                 <w:i/>
               </w:rPr>
-            </w:pPr>
-            <w:r>
+              <w:t xml:space="preserve">      &lt;Name&gt;samples&lt;/Name&gt;      </w:t>
+            </w:r>
+          </w:p>
+          <w:p>
+            <w:pPr>
+              <w:ind w:leftChars="400" w:left="840" w:firstLineChars="100" w:firstLine="210"/>
               <w:rPr>
                 <w:rFonts w:cstheme="minorHAnsi"/>
                 <w:i/>
               </w:rPr>
-              <w:t xml:space="preserve">      &lt;Name&gt;quotes&lt;/Name&gt;   </w:t>
-            </w:r>
-          </w:p>
-          <w:p>
-            <w:pPr>
-              <w:ind w:leftChars="300" w:left="840" w:hangingChars="100" w:hanging="210"/>
+            </w:pPr>
+            <w:r>
               <w:rPr>
                 <w:rFonts w:cstheme="minorHAnsi"/>
                 <w:i/>
               </w:rPr>
-            </w:pPr>
-            <w:r>
+              <w:t xml:space="preserve">&lt;CreationDate&gt;2006-02-03T16:41:58.000Z&lt;/CreationDate&gt;  </w:t>
+            </w:r>
+          </w:p>
+          <w:p>
+            <w:pPr>
+              <w:ind w:leftChars="356"/>
               <w:rPr>
                 <w:rFonts w:cstheme="minorHAnsi"/>
                 <w:i/>
               </w:rPr>
-              <w:t xml:space="preserve">   &lt;</w:t>
-            </w:r>
-            <w:proofErr w:type="spellStart"/>
+            </w:pPr>
             <w:r>
               <w:rPr>
                 <w:rFonts w:cstheme="minorHAnsi"/>
                 <w:i/>
               </w:rPr>
-              <w:t>CreationDate</w:t>
-            </w:r>
-            <w:proofErr w:type="spellEnd"/>
-            <w:r>
+              <w:t xml:space="preserve">&lt;/Bucket&gt; </w:t>
+            </w:r>
+          </w:p>
+          <w:p>
+            <w:pPr>
+              <w:ind w:left="0" w:firstLineChars="200" w:firstLine="420"/>
               <w:rPr>
                 <w:rFonts w:cstheme="minorHAnsi"/>
                 <w:i/>
               </w:rPr>
-              <w:t>&gt;2006-02-03T16:45:09.000Z&lt;/</w:t>
-            </w:r>
-            <w:proofErr w:type="spellStart"/>
+            </w:pPr>
             <w:r>
               <w:rPr>
                 <w:rFonts w:cstheme="minorHAnsi"/>
                 <w:i/>
               </w:rPr>
-              <w:t>CreationDate</w:t>
-            </w:r>
-            <w:proofErr w:type="spellEnd"/>
+              <w:t xml:space="preserve">&lt;/Buckets&gt; </w:t>
+            </w:r>
+          </w:p>
+          <w:p>
+            <w:pPr>
+              <w:ind w:left="0"/>
+              <w:rPr>
+                <w:rFonts w:cstheme="minorHAnsi"/>
+              </w:rPr>
+            </w:pPr>
             <w:r>
               <w:rPr>
                 <w:rFonts w:cstheme="minorHAnsi"/>
                 <w:i/>
               </w:rPr>
-              <w:t xml:space="preserve">&gt;  </w:t>
-            </w:r>
-          </w:p>
-          <w:p>
-            <w:pPr>
-              <w:ind w:leftChars="300" w:left="840" w:hangingChars="100" w:hanging="210"/>
-              <w:rPr>
-                <w:rFonts w:cstheme="minorHAnsi"/>
-                <w:i/>
-              </w:rPr>
-            </w:pPr>
-            <w:r>
-              <w:rPr>
-                <w:rFonts w:cstheme="minorHAnsi"/>
-                <w:i/>
-              </w:rPr>
-              <w:t xml:space="preserve">  &lt;/Bucket&gt;  </w:t>
-            </w:r>
-          </w:p>
-          <w:p>
-            <w:pPr>
-              <w:ind w:left="0" w:firstLineChars="100" w:firstLine="210"/>
-              <w:rPr>
-                <w:rFonts w:cstheme="minorHAnsi"/>
-                <w:i/>
-              </w:rPr>
-            </w:pPr>
-            <w:r>
-              <w:rPr>
-                <w:rFonts w:cstheme="minorHAnsi"/>
-                <w:i/>
-              </w:rPr>
-              <w:t xml:space="preserve">      &lt;Bucket&gt;</w:t>
-            </w:r>
-          </w:p>
-          <w:p>
-            <w:pPr>
-              <w:ind w:left="0" w:firstLineChars="200" w:firstLine="420"/>
-              <w:rPr>
-                <w:rFonts w:cstheme="minorHAnsi"/>
-                <w:i/>
-              </w:rPr>
-            </w:pPr>
-            <w:r>
-              <w:rPr>
-                <w:rFonts w:cstheme="minorHAnsi"/>
-                <w:i/>
-              </w:rPr>
-              <w:t xml:space="preserve">      &lt;Name&gt;samples&lt;/Name&gt;      </w:t>
-            </w:r>
-          </w:p>
-          <w:p>
-            <w:pPr>
-              <w:ind w:leftChars="400" w:left="840" w:firstLineChars="100" w:firstLine="210"/>
-              <w:rPr>
-                <w:rFonts w:cstheme="minorHAnsi"/>
-                <w:i/>
-              </w:rPr>
-            </w:pPr>
-            <w:r>
-              <w:rPr>
-                <w:rFonts w:cstheme="minorHAnsi"/>
-                <w:i/>
-              </w:rPr>
-              <w:t>&lt;</w:t>
-            </w:r>
-            <w:proofErr w:type="spellStart"/>
-            <w:r>
-              <w:rPr>
-                <w:rFonts w:cstheme="minorHAnsi"/>
-                <w:i/>
-              </w:rPr>
-              <w:t>CreationDate</w:t>
-            </w:r>
-            <w:proofErr w:type="spellEnd"/>
-            <w:r>
-              <w:rPr>
-                <w:rFonts w:cstheme="minorHAnsi"/>
-                <w:i/>
-              </w:rPr>
-              <w:t>&gt;2006-02-03T16:41:58.000Z&lt;/</w:t>
-            </w:r>
-            <w:proofErr w:type="spellStart"/>
-            <w:r>
-              <w:rPr>
-                <w:rFonts w:cstheme="minorHAnsi"/>
-                <w:i/>
-              </w:rPr>
-              <w:t>CreationDate</w:t>
-            </w:r>
-            <w:proofErr w:type="spellEnd"/>
-            <w:r>
-              <w:rPr>
-                <w:rFonts w:cstheme="minorHAnsi"/>
-                <w:i/>
-              </w:rPr>
-              <w:t xml:space="preserve">&gt;  </w:t>
-            </w:r>
-          </w:p>
-          <w:p>
-            <w:pPr>
-              <w:ind w:leftChars="356"/>
-              <w:rPr>
-                <w:rFonts w:cstheme="minorHAnsi"/>
-                <w:i/>
-              </w:rPr>
-            </w:pPr>
-            <w:r>
-              <w:rPr>
-                <w:rFonts w:cstheme="minorHAnsi"/>
-                <w:i/>
-              </w:rPr>
-              <w:t xml:space="preserve">&lt;/Bucket&gt; </w:t>
-            </w:r>
-          </w:p>
-          <w:p>
-            <w:pPr>
-              <w:ind w:left="0" w:firstLineChars="200" w:firstLine="420"/>
-              <w:rPr>
-                <w:rFonts w:cstheme="minorHAnsi"/>
-                <w:i/>
-              </w:rPr>
-            </w:pPr>
-            <w:r>
-              <w:rPr>
-                <w:rFonts w:cstheme="minorHAnsi"/>
-                <w:i/>
-              </w:rPr>
-              <w:t xml:space="preserve">&lt;/Buckets&gt; </w:t>
-            </w:r>
-          </w:p>
-          <w:p>
-            <w:pPr>
-              <w:ind w:left="0"/>
-              <w:rPr>
-                <w:rFonts w:cstheme="minorHAnsi"/>
-              </w:rPr>
-            </w:pPr>
-            <w:r>
-              <w:rPr>
-                <w:rFonts w:cstheme="minorHAnsi"/>
-                <w:i/>
-              </w:rPr>
               <w:lastRenderedPageBreak/>
-              <w:t>&lt;/</w:t>
-            </w:r>
-            <w:proofErr w:type="spellStart"/>
-            <w:r>
-              <w:rPr>
-                <w:rFonts w:cstheme="minorHAnsi"/>
-                <w:i/>
-              </w:rPr>
-              <w:t>ListAllMyBucketsResult</w:t>
-            </w:r>
-            <w:proofErr w:type="spellEnd"/>
-            <w:r>
-              <w:rPr>
-                <w:rFonts w:cstheme="minorHAnsi"/>
-                <w:i/>
-              </w:rPr>
-              <w:t xml:space="preserve">&gt; </w:t>
+              <w:t xml:space="preserve">&lt;/ListAllMyBucketsResult&gt; </w:t>
             </w:r>
           </w:p>
         </w:tc>
@@ -2867,21 +2579,7 @@
               <w:rPr>
                 <w:rFonts w:hint="eastAsia"/>
               </w:rPr>
-              <w:t>允许出现</w:t>
-            </w:r>
-            <w:proofErr w:type="gramStart"/>
-            <w:r>
-              <w:rPr>
-                <w:rFonts w:hint="eastAsia"/>
-              </w:rPr>
-              <w:t>在桶名中间</w:t>
-            </w:r>
-            <w:proofErr w:type="gramEnd"/>
-            <w:r>
-              <w:rPr>
-                <w:rFonts w:hint="eastAsia"/>
-              </w:rPr>
-              <w:t>，不允许出现在开始和结尾，不允许连续出现</w:t>
+              <w:t>允许出现在桶名中间，不允许出现在开始和结尾，不允许连续出现</w:t>
             </w:r>
           </w:p>
         </w:tc>
@@ -3101,34 +2799,15 @@
         </w:rPr>
         <w:t>，参考</w:t>
       </w:r>
-      <w:r>
-        <w:fldChar w:fldCharType="begin"/>
-      </w:r>
-      <w:r>
-        <w:instrText xml:space="preserve"> HYPERLINK \l "_</w:instrText>
-      </w:r>
-      <w:r>
-        <w:instrText>公共头部</w:instrText>
-      </w:r>
-      <w:r>
-        <w:instrText xml:space="preserve">" </w:instrText>
-      </w:r>
-      <w:r>
-        <w:fldChar w:fldCharType="separate"/>
-      </w:r>
-      <w:r>
-        <w:rPr>
-          <w:rStyle w:val="ad"/>
-          <w:rFonts w:hint="eastAsia"/>
-        </w:rPr>
-        <w:t>公共头部</w:t>
-      </w:r>
-      <w:r>
-        <w:rPr>
-          <w:rStyle w:val="ad"/>
-        </w:rPr>
-        <w:fldChar w:fldCharType="end"/>
-      </w:r>
+      <w:hyperlink w:anchor="_公共头部" w:history="1">
+        <w:r>
+          <w:rPr>
+            <w:rStyle w:val="ad"/>
+            <w:rFonts w:hint="eastAsia"/>
+          </w:rPr>
+          <w:t>公共头部</w:t>
+        </w:r>
+      </w:hyperlink>
       <w:r>
         <w:rPr>
           <w:rFonts w:hint="eastAsia"/>
@@ -3308,103 +2987,23 @@
                 <w:rFonts w:cstheme="minorHAnsi"/>
                 <w:i/>
               </w:rPr>
-              <w:t>&lt;</w:t>
-            </w:r>
-            <w:proofErr w:type="spellStart"/>
-            <w:r>
+              <w:t>&lt;CreateBucketConfiguration&gt;</w:t>
+            </w:r>
+          </w:p>
+          <w:p>
+            <w:pPr>
+              <w:ind w:left="0"/>
               <w:rPr>
                 <w:rFonts w:cstheme="minorHAnsi"/>
                 <w:i/>
               </w:rPr>
-              <w:t>CreateBucketConfiguration</w:t>
-            </w:r>
-            <w:proofErr w:type="spellEnd"/>
+            </w:pPr>
             <w:r>
               <w:rPr>
                 <w:rFonts w:cstheme="minorHAnsi"/>
                 <w:i/>
               </w:rPr>
-              <w:t>&gt;</w:t>
-            </w:r>
-          </w:p>
-          <w:p>
-            <w:pPr>
-              <w:ind w:left="0"/>
-              <w:rPr>
-                <w:rFonts w:cstheme="minorHAnsi"/>
-                <w:i/>
-              </w:rPr>
-            </w:pPr>
-            <w:r>
-              <w:rPr>
-                <w:rFonts w:cstheme="minorHAnsi"/>
-                <w:i/>
-              </w:rPr>
-              <w:t xml:space="preserve">   &lt;</w:t>
-            </w:r>
-            <w:proofErr w:type="spellStart"/>
-            <w:r>
-              <w:rPr>
-                <w:rFonts w:cstheme="minorHAnsi"/>
-                <w:i/>
-              </w:rPr>
-              <w:t>LocationConstraint</w:t>
-            </w:r>
-            <w:proofErr w:type="spellEnd"/>
-            <w:r>
-              <w:rPr>
-                <w:rFonts w:cstheme="minorHAnsi"/>
-                <w:i/>
-              </w:rPr>
-              <w:t>&gt;</w:t>
-            </w:r>
-            <w:proofErr w:type="spellStart"/>
-            <w:r>
-              <w:rPr>
-                <w:rFonts w:cstheme="minorHAnsi"/>
-                <w:i/>
-              </w:rPr>
-              <w:t>BucketRegion</w:t>
-            </w:r>
-            <w:proofErr w:type="spellEnd"/>
-            <w:r>
-              <w:rPr>
-                <w:rFonts w:cstheme="minorHAnsi"/>
-                <w:i/>
-              </w:rPr>
-              <w:t>&lt;/</w:t>
-            </w:r>
-            <w:proofErr w:type="spellStart"/>
-            <w:r>
-              <w:rPr>
-                <w:rFonts w:cstheme="minorHAnsi"/>
-                <w:i/>
-              </w:rPr>
-              <w:t>LocationConstraint</w:t>
-            </w:r>
-            <w:proofErr w:type="spellEnd"/>
-            <w:r>
-              <w:rPr>
-                <w:rFonts w:cstheme="minorHAnsi"/>
-                <w:i/>
-              </w:rPr>
-              <w:t>&gt;   &lt;/</w:t>
-            </w:r>
-            <w:proofErr w:type="spellStart"/>
-            <w:r>
-              <w:rPr>
-                <w:rFonts w:cstheme="minorHAnsi"/>
-                <w:i/>
-              </w:rPr>
-              <w:t>CreateBucketConfiguration</w:t>
-            </w:r>
-            <w:proofErr w:type="spellEnd"/>
-            <w:r>
-              <w:rPr>
-                <w:rFonts w:cstheme="minorHAnsi"/>
-                <w:i/>
-              </w:rPr>
-              <w:t>&gt;</w:t>
+              <w:t xml:space="preserve">   &lt;LocationConstraint&gt;BucketRegion&lt;/LocationConstraint&gt;   &lt;/CreateBucketConfiguration&gt;</w:t>
             </w:r>
           </w:p>
         </w:tc>
@@ -3480,55 +3079,23 @@
                 <w:rFonts w:cstheme="minorHAnsi"/>
                 <w:i/>
               </w:rPr>
-              <w:t xml:space="preserve">Date: Wed, 01 </w:t>
-            </w:r>
-            <w:proofErr w:type="gramStart"/>
-            <w:r>
+              <w:t>Date: Wed, 01 Mar  2006 12:00:00 GMT</w:t>
+            </w:r>
+          </w:p>
+          <w:p>
+            <w:pPr>
+              <w:ind w:left="0"/>
               <w:rPr>
                 <w:rFonts w:cstheme="minorHAnsi"/>
                 <w:i/>
               </w:rPr>
-              <w:t>Mar  2006</w:t>
-            </w:r>
-            <w:proofErr w:type="gramEnd"/>
+            </w:pPr>
             <w:r>
               <w:rPr>
                 <w:rFonts w:cstheme="minorHAnsi"/>
                 <w:i/>
               </w:rPr>
-              <w:t xml:space="preserve"> 12:00:00 GMT</w:t>
-            </w:r>
-          </w:p>
-          <w:p>
-            <w:pPr>
-              <w:ind w:left="0"/>
-              <w:rPr>
-                <w:rFonts w:cstheme="minorHAnsi"/>
-                <w:i/>
-              </w:rPr>
-            </w:pPr>
-            <w:r>
-              <w:rPr>
-                <w:rFonts w:cstheme="minorHAnsi"/>
-                <w:i/>
-              </w:rPr>
-              <w:t>Location: /</w:t>
-            </w:r>
-            <w:proofErr w:type="spellStart"/>
-            <w:r>
-              <w:rPr>
-                <w:rFonts w:cstheme="minorHAnsi"/>
-                <w:i/>
-              </w:rPr>
-              <w:t>colorpictures</w:t>
-            </w:r>
-            <w:proofErr w:type="spellEnd"/>
-            <w:r>
-              <w:rPr>
-                <w:rFonts w:cstheme="minorHAnsi"/>
-                <w:i/>
-              </w:rPr>
-              <w:t xml:space="preserve"> </w:t>
+              <w:t xml:space="preserve">Location: /colorpictures </w:t>
             </w:r>
           </w:p>
           <w:p>
@@ -3647,21 +3214,7 @@
         <w:rPr>
           <w:rFonts w:cstheme="minorHAnsi" w:hint="eastAsia"/>
         </w:rPr>
-        <w:t>删除</w:t>
-      </w:r>
-      <w:proofErr w:type="gramStart"/>
-      <w:r>
-        <w:rPr>
-          <w:rFonts w:cstheme="minorHAnsi" w:hint="eastAsia"/>
-        </w:rPr>
-        <w:t>桶成功</w:t>
-      </w:r>
-      <w:proofErr w:type="gramEnd"/>
-      <w:r>
-        <w:rPr>
-          <w:rFonts w:cstheme="minorHAnsi" w:hint="eastAsia"/>
-        </w:rPr>
-        <w:t>后，可以再用此名称创建新的桶。</w:t>
+        <w:t>删除桶成功后，可以再用此名称创建新的桶。</w:t>
       </w:r>
     </w:p>
     <w:p>
@@ -3679,7 +3232,6 @@
           <w:rFonts w:cstheme="minorHAnsi"/>
         </w:rPr>
       </w:pPr>
-      <w:proofErr w:type="gramStart"/>
       <w:r>
         <w:rPr>
           <w:rFonts w:cstheme="minorHAnsi" w:hint="eastAsia"/>
@@ -3690,14 +3242,7 @@
         <w:rPr>
           <w:rFonts w:cstheme="minorHAnsi"/>
         </w:rPr>
-        <w:t>样例</w:t>
-      </w:r>
-      <w:proofErr w:type="gramEnd"/>
-      <w:r>
-        <w:rPr>
-          <w:rFonts w:cstheme="minorHAnsi"/>
-        </w:rPr>
-        <w:t>：</w:t>
+        <w:t>样例：</w:t>
       </w:r>
     </w:p>
     <w:tbl>
@@ -3889,25 +3434,258 @@
       <w:bookmarkStart w:id="2" w:name="_公共头部"/>
       <w:bookmarkEnd w:id="2"/>
       <w:r>
-        <w:t>PUT Bucket versioning</w:t>
+        <w:rPr>
+          <w:rFonts w:hint="eastAsia"/>
+        </w:rPr>
+        <w:t>HEAD</w:t>
+      </w:r>
+      <w:r>
+        <w:t xml:space="preserve"> </w:t>
+      </w:r>
+      <w:r>
+        <w:rPr>
+          <w:rFonts w:hint="eastAsia"/>
+        </w:rPr>
+        <w:t>Bucket</w:t>
       </w:r>
     </w:p>
     <w:p>
       <w:pPr>
-        <w:ind w:left="0" w:firstLineChars="200" w:firstLine="420"/>
-      </w:pPr>
-      <w:r>
-        <w:rPr>
-          <w:rFonts w:hint="eastAsia"/>
-        </w:rPr>
-        <w:t>设置桶的版本控制状态，只有桶的所有者才能执行此操作。</w:t>
+        <w:ind w:left="0" w:firstLine="420"/>
+      </w:pPr>
+      <w:r>
+        <w:rPr>
+          <w:rFonts w:hint="eastAsia"/>
+        </w:rPr>
+        <w:t>查询桶是否存在并且是否允许访问。</w:t>
       </w:r>
     </w:p>
     <w:p>
       <w:pPr>
+        <w:ind w:left="0" w:firstLine="420"/>
+      </w:pPr>
+      <w:r>
+        <w:t>Request Headers</w:t>
+      </w:r>
+      <w:r>
+        <w:rPr>
+          <w:rFonts w:hint="eastAsia"/>
+        </w:rPr>
+        <w:t>：无特殊</w:t>
+      </w:r>
+      <w:r>
+        <w:rPr>
+          <w:rFonts w:hint="eastAsia"/>
+        </w:rPr>
+        <w:t>Header</w:t>
+      </w:r>
+      <w:r>
+        <w:rPr>
+          <w:rFonts w:hint="eastAsia"/>
+        </w:rPr>
+        <w:t>，参考</w:t>
+      </w:r>
+      <w:hyperlink w:anchor="_公共头部" w:history="1">
+        <w:r>
+          <w:rPr>
+            <w:rStyle w:val="ad"/>
+            <w:rFonts w:hint="eastAsia"/>
+          </w:rPr>
+          <w:t>公共头部</w:t>
+        </w:r>
+      </w:hyperlink>
+      <w:r>
+        <w:rPr>
+          <w:rFonts w:hint="eastAsia"/>
+        </w:rPr>
+        <w:t>。</w:t>
+      </w:r>
+    </w:p>
+    <w:p>
+      <w:pPr>
+        <w:ind w:left="0" w:firstLine="420"/>
+        <w:rPr>
+          <w:rStyle w:val="ad"/>
+        </w:rPr>
+      </w:pPr>
+      <w:r>
+        <w:rPr>
+          <w:rFonts w:hint="eastAsia"/>
+        </w:rPr>
+        <w:t>Response</w:t>
+      </w:r>
+      <w:r>
+        <w:t xml:space="preserve"> </w:t>
+      </w:r>
+      <w:r>
+        <w:rPr>
+          <w:rFonts w:hint="eastAsia"/>
+        </w:rPr>
+        <w:t>header</w:t>
+      </w:r>
+      <w:r>
+        <w:rPr>
+          <w:rFonts w:hint="eastAsia"/>
+        </w:rPr>
+        <w:t>无特殊</w:t>
+      </w:r>
+      <w:r>
+        <w:rPr>
+          <w:rFonts w:hint="eastAsia"/>
+        </w:rPr>
+        <w:t>Header</w:t>
+      </w:r>
+      <w:r>
+        <w:rPr>
+          <w:rFonts w:hint="eastAsia"/>
+        </w:rPr>
+        <w:t>，参考</w:t>
+      </w:r>
+      <w:hyperlink w:anchor="_公共头部" w:history="1">
+        <w:r>
+          <w:rPr>
+            <w:rStyle w:val="ad"/>
+            <w:rFonts w:hint="eastAsia"/>
+          </w:rPr>
+          <w:t>公共头部</w:t>
+        </w:r>
+      </w:hyperlink>
+      <w:r>
+        <w:rPr>
+          <w:rStyle w:val="ad"/>
+          <w:rFonts w:hint="eastAsia"/>
+        </w:rPr>
+        <w:t>。</w:t>
+      </w:r>
+    </w:p>
+    <w:p>
+      <w:pPr>
+        <w:ind w:left="0" w:firstLine="420"/>
+      </w:pPr>
+      <w:r>
+        <w:rPr>
+          <w:rFonts w:hint="eastAsia"/>
+        </w:rPr>
+        <w:t>无响应</w:t>
+      </w:r>
+      <w:r>
+        <w:rPr>
+          <w:rFonts w:hint="eastAsia"/>
+        </w:rPr>
+        <w:t>body</w:t>
+      </w:r>
+    </w:p>
+    <w:p>
+      <w:pPr>
+        <w:ind w:left="0" w:firstLine="420"/>
+      </w:pPr>
+    </w:p>
+    <w:p>
+      <w:pPr>
+        <w:ind w:left="0" w:firstLine="420"/>
+      </w:pPr>
+      <w:r>
+        <w:rPr>
+          <w:rFonts w:hint="eastAsia"/>
+        </w:rPr>
+        <w:t>返回状态码：</w:t>
+      </w:r>
+    </w:p>
+    <w:p>
+      <w:pPr>
+        <w:ind w:left="0" w:firstLine="420"/>
+        <w:rPr>
+          <w:rFonts w:hint="eastAsia"/>
+        </w:rPr>
+      </w:pPr>
+      <w:r>
+        <w:rPr>
+          <w:rFonts w:hint="eastAsia"/>
+        </w:rPr>
+        <w:t>桶存在并且有权限访问，返回</w:t>
+      </w:r>
+      <w:r>
+        <w:rPr>
+          <w:rFonts w:hint="eastAsia"/>
+        </w:rPr>
+        <w:t>200</w:t>
+      </w:r>
+      <w:r>
+        <w:t xml:space="preserve"> ok .</w:t>
+      </w:r>
+    </w:p>
+    <w:p>
+      <w:pPr>
+        <w:ind w:left="0" w:firstLine="420"/>
+        <w:rPr>
+          <w:rFonts w:hint="eastAsia"/>
+        </w:rPr>
+      </w:pPr>
+      <w:r>
+        <w:rPr>
+          <w:rFonts w:hint="eastAsia"/>
+        </w:rPr>
+        <w:t>当桶不存在，返回</w:t>
+      </w:r>
+      <w:r>
+        <w:rPr>
+          <w:rFonts w:hint="eastAsia"/>
+        </w:rPr>
+        <w:t>404</w:t>
+      </w:r>
+      <w:r>
+        <w:t xml:space="preserve"> Not Found .</w:t>
+      </w:r>
+    </w:p>
+    <w:p>
+      <w:pPr>
+        <w:ind w:left="0" w:firstLine="420"/>
+        <w:rPr>
+          <w:rFonts w:hint="eastAsia"/>
+        </w:rPr>
+      </w:pPr>
+      <w:r>
+        <w:rPr>
+          <w:rFonts w:hint="eastAsia"/>
+        </w:rPr>
+        <w:t>当桶存在，但无权限访问（目前尚未做权限控制，用户均无权限访问其他用户创建的桶），返回</w:t>
+      </w:r>
+      <w:r>
+        <w:rPr>
+          <w:rFonts w:hint="eastAsia"/>
+        </w:rPr>
+        <w:t>403</w:t>
+      </w:r>
+      <w:r>
+        <w:t xml:space="preserve"> Forbidden.</w:t>
+      </w:r>
+    </w:p>
+    <w:p>
+      <w:pPr>
+        <w:pStyle w:val="3"/>
+        <w:ind w:left="210"/>
+      </w:pPr>
+      <w:r>
+        <w:lastRenderedPageBreak/>
+        <w:t>PUT Bucket versioning</w:t>
+      </w:r>
+    </w:p>
+    <w:p>
+      <w:pPr>
         <w:ind w:left="0" w:firstLineChars="200" w:firstLine="420"/>
       </w:pPr>
       <w:r>
+        <w:rPr>
+          <w:rFonts w:hint="eastAsia"/>
+        </w:rPr>
+        <w:t>设置桶的版本控制状态，只有桶的所有者才能执行此操作。</w:t>
+      </w:r>
+    </w:p>
+    <w:p>
+      <w:pPr>
+        <w:ind w:left="0" w:firstLineChars="200" w:firstLine="420"/>
+      </w:pPr>
+      <w:r>
         <w:t>Request Headers</w:t>
       </w:r>
       <w:r>
@@ -3928,34 +3706,15 @@
         </w:rPr>
         <w:t>，参考</w:t>
       </w:r>
-      <w:r>
-        <w:fldChar w:fldCharType="begin"/>
-      </w:r>
-      <w:r>
-        <w:instrText xml:space="preserve"> HYPERLINK \l "_</w:instrText>
-      </w:r>
-      <w:r>
-        <w:instrText>公共头部</w:instrText>
-      </w:r>
-      <w:r>
-        <w:instrText xml:space="preserve">" </w:instrText>
-      </w:r>
-      <w:r>
-        <w:fldChar w:fldCharType="separate"/>
-      </w:r>
-      <w:r>
-        <w:rPr>
-          <w:rStyle w:val="ad"/>
-          <w:rFonts w:hint="eastAsia"/>
-        </w:rPr>
-        <w:t>公共头部</w:t>
-      </w:r>
-      <w:r>
-        <w:rPr>
-          <w:rStyle w:val="ad"/>
-        </w:rPr>
-        <w:fldChar w:fldCharType="end"/>
-      </w:r>
+      <w:hyperlink w:anchor="_公共头部" w:history="1">
+        <w:r>
+          <w:rPr>
+            <w:rStyle w:val="ad"/>
+            <w:rFonts w:hint="eastAsia"/>
+          </w:rPr>
+          <w:t>公共头部</w:t>
+        </w:r>
+      </w:hyperlink>
       <w:r>
         <w:rPr>
           <w:rFonts w:hint="eastAsia"/>
@@ -4076,11 +3835,9 @@
             <w:pPr>
               <w:ind w:left="0"/>
             </w:pPr>
-            <w:proofErr w:type="spellStart"/>
             <w:r>
               <w:t>VersioningConfiguration</w:t>
             </w:r>
-            <w:proofErr w:type="spellEnd"/>
           </w:p>
         </w:tc>
         <w:tc>
@@ -4178,14 +3935,12 @@
               </w:rPr>
               <w:t xml:space="preserve">: </w:t>
             </w:r>
-            <w:proofErr w:type="spellStart"/>
             <w:r>
               <w:rPr>
                 <w:rFonts w:hint="eastAsia"/>
               </w:rPr>
               <w:t>Enum</w:t>
             </w:r>
-            <w:proofErr w:type="spellEnd"/>
           </w:p>
           <w:p>
             <w:pPr>
@@ -4227,13 +3982,8 @@
               <w:ind w:left="0"/>
             </w:pPr>
             <w:r>
-              <w:t xml:space="preserve">Ancestor: </w:t>
-            </w:r>
-            <w:proofErr w:type="spellStart"/>
-            <w:r>
-              <w:t>VersioningConfiguration</w:t>
-            </w:r>
-            <w:proofErr w:type="spellEnd"/>
+              <w:t>Ancestor: VersioningConfiguration</w:t>
+            </w:r>
           </w:p>
         </w:tc>
         <w:tc>
@@ -4263,7 +4013,6 @@
         <w:rPr>
           <w:rFonts w:hint="eastAsia"/>
         </w:rPr>
-        <w:lastRenderedPageBreak/>
         <w:t>Response</w:t>
       </w:r>
       <w:r>
@@ -4293,34 +4042,15 @@
         </w:rPr>
         <w:t>，参考</w:t>
       </w:r>
-      <w:r>
-        <w:fldChar w:fldCharType="begin"/>
-      </w:r>
-      <w:r>
-        <w:instrText xml:space="preserve"> HYPERLINK \l "_</w:instrText>
-      </w:r>
-      <w:r>
-        <w:instrText>公共头部</w:instrText>
-      </w:r>
-      <w:r>
-        <w:instrText xml:space="preserve">" </w:instrText>
-      </w:r>
-      <w:r>
-        <w:fldChar w:fldCharType="separate"/>
-      </w:r>
-      <w:r>
-        <w:rPr>
-          <w:rStyle w:val="ad"/>
-          <w:rFonts w:hint="eastAsia"/>
-        </w:rPr>
-        <w:t>公共头部</w:t>
-      </w:r>
-      <w:r>
-        <w:rPr>
-          <w:rStyle w:val="ad"/>
-        </w:rPr>
-        <w:fldChar w:fldCharType="end"/>
-      </w:r>
+      <w:hyperlink w:anchor="_公共头部" w:history="1">
+        <w:r>
+          <w:rPr>
+            <w:rStyle w:val="ad"/>
+            <w:rFonts w:hint="eastAsia"/>
+          </w:rPr>
+          <w:t>公共头部</w:t>
+        </w:r>
+      </w:hyperlink>
       <w:r>
         <w:rPr>
           <w:rStyle w:val="ad"/>
@@ -4387,7 +4117,6 @@
               </w:rPr>
               <w:t>}</w:t>
             </w:r>
-            <w:proofErr w:type="gramStart"/>
             <w:r>
               <w:rPr>
                 <w:i/>
@@ -4398,46 +4127,103 @@
               <w:rPr>
                 <w:i/>
               </w:rPr>
-              <w:t>?versioning</w:t>
-            </w:r>
-            <w:proofErr w:type="gramEnd"/>
-            <w:r>
+              <w:t xml:space="preserve">?versioning HTTP/1.1 </w:t>
+            </w:r>
+          </w:p>
+          <w:p>
+            <w:pPr>
+              <w:ind w:left="0"/>
               <w:rPr>
                 <w:i/>
               </w:rPr>
-              <w:t xml:space="preserve"> HTTP/1.1 </w:t>
-            </w:r>
-          </w:p>
-          <w:p>
-            <w:pPr>
-              <w:ind w:left="0"/>
+            </w:pPr>
+            <w:r>
               <w:rPr>
                 <w:i/>
               </w:rPr>
-            </w:pPr>
-            <w:r>
-              <w:rPr>
+              <w:t>Host:</w:t>
+            </w:r>
+            <w:r>
+              <w:rPr>
+                <w:rFonts w:hint="eastAsia"/>
                 <w:i/>
               </w:rPr>
-              <w:t>Host:</w:t>
-            </w:r>
-            <w:r>
-              <w:rPr>
-                <w:rFonts w:hint="eastAsia"/>
+              <w:t>sequoia.</w:t>
+            </w:r>
+            <w:r>
+              <w:rPr>
                 <w:i/>
               </w:rPr>
-              <w:t>sequoia.</w:t>
+              <w:t>s3.com</w:t>
             </w:r>
             <w:r>
               <w:rPr>
                 <w:i/>
               </w:rPr>
-              <w:t>s3.com</w:t>
-            </w:r>
-            <w:r>
+              <w:t xml:space="preserve"> </w:t>
+            </w:r>
+          </w:p>
+          <w:p>
+            <w:pPr>
+              <w:ind w:left="0"/>
               <w:rPr>
                 <w:i/>
               </w:rPr>
+            </w:pPr>
+            <w:r>
+              <w:rPr>
+                <w:i/>
+              </w:rPr>
+              <w:t xml:space="preserve">Date: Wed, 01 Mar  2006 12:00:00 GMT </w:t>
+            </w:r>
+          </w:p>
+          <w:p>
+            <w:pPr>
+              <w:ind w:left="0"/>
+              <w:rPr>
+                <w:i/>
+              </w:rPr>
+            </w:pPr>
+            <w:r>
+              <w:rPr>
+                <w:i/>
+              </w:rPr>
+              <w:t xml:space="preserve">Authorization: authorization string </w:t>
+            </w:r>
+          </w:p>
+          <w:p>
+            <w:pPr>
+              <w:ind w:left="0"/>
+              <w:rPr>
+                <w:i/>
+              </w:rPr>
+            </w:pPr>
+            <w:r>
+              <w:rPr>
+                <w:i/>
+              </w:rPr>
+              <w:t xml:space="preserve">Content-Type: text/plain </w:t>
+            </w:r>
+          </w:p>
+          <w:p>
+            <w:pPr>
+              <w:ind w:left="0"/>
+              <w:rPr>
+                <w:i/>
+              </w:rPr>
+            </w:pPr>
+            <w:r>
+              <w:rPr>
+                <w:i/>
+              </w:rPr>
+              <w:t>Content-Length: xxx</w:t>
+            </w:r>
+          </w:p>
+          <w:p>
+            <w:pPr>
+              <w:ind w:left="0"/>
+            </w:pPr>
+            <w:r>
               <w:t xml:space="preserve"> </w:t>
             </w:r>
           </w:p>
@@ -4452,138 +4238,32 @@
               <w:rPr>
                 <w:i/>
               </w:rPr>
-              <w:t xml:space="preserve">Date: Wed, 01 </w:t>
-            </w:r>
-            <w:proofErr w:type="gramStart"/>
-            <w:r>
+              <w:t>&lt;VersioningConfiguration&gt;</w:t>
+            </w:r>
+          </w:p>
+          <w:p>
+            <w:pPr>
+              <w:ind w:left="0"/>
               <w:rPr>
                 <w:i/>
               </w:rPr>
-              <w:t>Mar  2006</w:t>
-            </w:r>
-            <w:proofErr w:type="gramEnd"/>
+            </w:pPr>
             <w:r>
               <w:rPr>
                 <w:i/>
               </w:rPr>
-              <w:t xml:space="preserve"> 12:00:00 GMT </w:t>
-            </w:r>
-          </w:p>
-          <w:p>
-            <w:pPr>
-              <w:ind w:left="0"/>
+              <w:t xml:space="preserve">   &lt;Status&gt;Enabled&lt;/Status&gt; </w:t>
+            </w:r>
+          </w:p>
+          <w:p>
+            <w:pPr>
+              <w:ind w:left="0"/>
+            </w:pPr>
+            <w:r>
               <w:rPr>
                 <w:i/>
               </w:rPr>
-            </w:pPr>
-            <w:r>
-              <w:rPr>
-                <w:i/>
-              </w:rPr>
-              <w:t xml:space="preserve">Authorization: authorization string </w:t>
-            </w:r>
-          </w:p>
-          <w:p>
-            <w:pPr>
-              <w:ind w:left="0"/>
-              <w:rPr>
-                <w:i/>
-              </w:rPr>
-            </w:pPr>
-            <w:r>
-              <w:rPr>
-                <w:i/>
-              </w:rPr>
-              <w:t xml:space="preserve">Content-Type: text/plain </w:t>
-            </w:r>
-          </w:p>
-          <w:p>
-            <w:pPr>
-              <w:ind w:left="0"/>
-              <w:rPr>
-                <w:i/>
-              </w:rPr>
-            </w:pPr>
-            <w:r>
-              <w:rPr>
-                <w:i/>
-              </w:rPr>
-              <w:t>Content-Length: xxx</w:t>
-            </w:r>
-          </w:p>
-          <w:p>
-            <w:pPr>
-              <w:ind w:left="0"/>
-            </w:pPr>
-            <w:r>
-              <w:t xml:space="preserve"> </w:t>
-            </w:r>
-          </w:p>
-          <w:p>
-            <w:pPr>
-              <w:ind w:left="0"/>
-              <w:rPr>
-                <w:i/>
-              </w:rPr>
-            </w:pPr>
-            <w:r>
-              <w:rPr>
-                <w:i/>
-              </w:rPr>
-              <w:t>&lt;</w:t>
-            </w:r>
-            <w:proofErr w:type="spellStart"/>
-            <w:r>
-              <w:rPr>
-                <w:i/>
-              </w:rPr>
-              <w:t>VersioningConfiguration</w:t>
-            </w:r>
-            <w:proofErr w:type="spellEnd"/>
-            <w:r>
-              <w:rPr>
-                <w:i/>
-              </w:rPr>
-              <w:t>&gt;</w:t>
-            </w:r>
-          </w:p>
-          <w:p>
-            <w:pPr>
-              <w:ind w:left="0"/>
-              <w:rPr>
-                <w:i/>
-              </w:rPr>
-            </w:pPr>
-            <w:r>
-              <w:rPr>
-                <w:i/>
-              </w:rPr>
-              <w:t xml:space="preserve">   &lt;Status&gt;Enabled&lt;/Status&gt; </w:t>
-            </w:r>
-          </w:p>
-          <w:p>
-            <w:pPr>
-              <w:ind w:left="0"/>
-            </w:pPr>
-            <w:r>
-              <w:rPr>
-                <w:i/>
-              </w:rPr>
-              <w:t>&lt;/</w:t>
-            </w:r>
-            <w:proofErr w:type="spellStart"/>
-            <w:r>
-              <w:rPr>
-                <w:i/>
-              </w:rPr>
-              <w:t>VersioningConfiguration</w:t>
-            </w:r>
-            <w:proofErr w:type="spellEnd"/>
-            <w:r>
-              <w:rPr>
-                <w:i/>
-              </w:rPr>
-              <w:t>&gt;</w:t>
+              <w:t>&lt;/VersioningConfiguration&gt;</w:t>
             </w:r>
           </w:p>
         </w:tc>
@@ -4681,34 +4361,15 @@
         </w:rPr>
         <w:t>，参考</w:t>
       </w:r>
-      <w:r>
-        <w:fldChar w:fldCharType="begin"/>
-      </w:r>
-      <w:r>
-        <w:instrText xml:space="preserve"> HYPERLINK \l "_</w:instrText>
-      </w:r>
-      <w:r>
-        <w:instrText>公共头部</w:instrText>
-      </w:r>
-      <w:r>
-        <w:instrText xml:space="preserve">" </w:instrText>
-      </w:r>
-      <w:r>
-        <w:fldChar w:fldCharType="separate"/>
-      </w:r>
-      <w:r>
-        <w:rPr>
-          <w:rStyle w:val="ad"/>
-          <w:rFonts w:hint="eastAsia"/>
-        </w:rPr>
-        <w:t>公共头部</w:t>
-      </w:r>
-      <w:r>
-        <w:rPr>
-          <w:rStyle w:val="ad"/>
-        </w:rPr>
-        <w:fldChar w:fldCharType="end"/>
-      </w:r>
+      <w:hyperlink w:anchor="_公共头部" w:history="1">
+        <w:r>
+          <w:rPr>
+            <w:rStyle w:val="ad"/>
+            <w:rFonts w:hint="eastAsia"/>
+          </w:rPr>
+          <w:t>公共头部</w:t>
+        </w:r>
+      </w:hyperlink>
       <w:r>
         <w:rPr>
           <w:rFonts w:hint="eastAsia"/>
@@ -4842,14 +4503,13 @@
                 <w:rFonts w:cstheme="minorHAnsi"/>
               </w:rPr>
             </w:pPr>
-            <w:proofErr w:type="spellStart"/>
             <w:r>
               <w:rPr>
                 <w:rFonts w:cstheme="minorHAnsi"/>
               </w:rPr>
+              <w:lastRenderedPageBreak/>
               <w:t>VersioningConfiguration</w:t>
             </w:r>
-            <w:proofErr w:type="spellEnd"/>
           </w:p>
         </w:tc>
         <w:tc>
@@ -4980,16 +4640,8 @@
               <w:rPr>
                 <w:rFonts w:cstheme="minorHAnsi"/>
               </w:rPr>
-              <w:t xml:space="preserve">Ancestor: </w:t>
-            </w:r>
-            <w:proofErr w:type="spellStart"/>
-            <w:r>
-              <w:rPr>
-                <w:rFonts w:cstheme="minorHAnsi"/>
-              </w:rPr>
-              <w:t>VersioningConfiguration</w:t>
-            </w:r>
-            <w:proofErr w:type="spellEnd"/>
+              <w:t>Ancestor: VersioningConfiguration</w:t>
+            </w:r>
           </w:p>
         </w:tc>
       </w:tr>
@@ -5057,7 +4709,6 @@
               </w:rPr>
               <w:t>}</w:t>
             </w:r>
-            <w:proofErr w:type="gramStart"/>
             <w:r>
               <w:rPr>
                 <w:i/>
@@ -5068,14 +4719,7 @@
               <w:rPr>
                 <w:i/>
               </w:rPr>
-              <w:t>?versioning</w:t>
-            </w:r>
-            <w:proofErr w:type="gramEnd"/>
-            <w:r>
-              <w:rPr>
-                <w:i/>
-              </w:rPr>
-              <w:t xml:space="preserve"> HTTP/1.1 </w:t>
+              <w:t xml:space="preserve">?versioning HTTP/1.1 </w:t>
             </w:r>
           </w:p>
           <w:p>
@@ -5159,7 +4803,6 @@
         <w:rPr>
           <w:rFonts w:hint="eastAsia"/>
         </w:rPr>
-        <w:lastRenderedPageBreak/>
         <w:t>响应样例（打开版本控制）：</w:t>
       </w:r>
     </w:p>
@@ -5189,60 +4832,32 @@
               <w:rPr>
                 <w:i/>
               </w:rPr>
-              <w:t>&lt;</w:t>
-            </w:r>
-            <w:proofErr w:type="spellStart"/>
-            <w:r>
+              <w:t>&lt;VersioningConfiguration&gt;</w:t>
+            </w:r>
+          </w:p>
+          <w:p>
+            <w:pPr>
+              <w:ind w:left="0"/>
               <w:rPr>
                 <w:i/>
               </w:rPr>
-              <w:t>VersioningConfiguration</w:t>
-            </w:r>
-            <w:proofErr w:type="spellEnd"/>
+            </w:pPr>
             <w:r>
               <w:rPr>
                 <w:i/>
               </w:rPr>
-              <w:t>&gt;</w:t>
-            </w:r>
-          </w:p>
-          <w:p>
-            <w:pPr>
-              <w:ind w:left="0"/>
+              <w:t xml:space="preserve">  &lt;Status&gt;Enabled&lt;/Status&gt; </w:t>
+            </w:r>
+          </w:p>
+          <w:p>
+            <w:pPr>
+              <w:ind w:left="0"/>
+            </w:pPr>
+            <w:r>
               <w:rPr>
                 <w:i/>
               </w:rPr>
-            </w:pPr>
-            <w:r>
-              <w:rPr>
-                <w:i/>
-              </w:rPr>
-              <w:t xml:space="preserve">  &lt;Status&gt;Enabled&lt;/Status&gt; </w:t>
-            </w:r>
-          </w:p>
-          <w:p>
-            <w:pPr>
-              <w:ind w:left="0"/>
-            </w:pPr>
-            <w:r>
-              <w:rPr>
-                <w:i/>
-              </w:rPr>
-              <w:t>&lt;/</w:t>
-            </w:r>
-            <w:proofErr w:type="spellStart"/>
-            <w:r>
-              <w:rPr>
-                <w:i/>
-              </w:rPr>
-              <w:t>VersioningConfiguration</w:t>
-            </w:r>
-            <w:proofErr w:type="spellEnd"/>
-            <w:r>
-              <w:rPr>
-                <w:i/>
-              </w:rPr>
-              <w:t>&gt;</w:t>
+              <w:t>&lt;/VersioningConfiguration&gt;</w:t>
             </w:r>
           </w:p>
         </w:tc>
@@ -5283,60 +4898,32 @@
               <w:rPr>
                 <w:i/>
               </w:rPr>
-              <w:t>&lt;</w:t>
-            </w:r>
-            <w:proofErr w:type="spellStart"/>
-            <w:r>
+              <w:t>&lt;VersioningConfiguratio&gt;</w:t>
+            </w:r>
+          </w:p>
+          <w:p>
+            <w:pPr>
+              <w:ind w:left="0"/>
               <w:rPr>
                 <w:i/>
               </w:rPr>
-              <w:t>VersioningConfiguratio</w:t>
-            </w:r>
-            <w:proofErr w:type="spellEnd"/>
+            </w:pPr>
             <w:r>
               <w:rPr>
                 <w:i/>
               </w:rPr>
-              <w:t>&gt;</w:t>
-            </w:r>
-          </w:p>
-          <w:p>
-            <w:pPr>
-              <w:ind w:left="0"/>
+              <w:t xml:space="preserve">  &lt;Status&gt;Suspended&lt;/Status&gt; </w:t>
+            </w:r>
+          </w:p>
+          <w:p>
+            <w:pPr>
+              <w:ind w:left="0"/>
+            </w:pPr>
+            <w:r>
               <w:rPr>
                 <w:i/>
               </w:rPr>
-            </w:pPr>
-            <w:r>
-              <w:rPr>
-                <w:i/>
-              </w:rPr>
-              <w:t xml:space="preserve">  &lt;Status&gt;Suspended&lt;/Status&gt; </w:t>
-            </w:r>
-          </w:p>
-          <w:p>
-            <w:pPr>
-              <w:ind w:left="0"/>
-            </w:pPr>
-            <w:r>
-              <w:rPr>
-                <w:i/>
-              </w:rPr>
-              <w:t>&lt;/</w:t>
-            </w:r>
-            <w:proofErr w:type="spellStart"/>
-            <w:r>
-              <w:rPr>
-                <w:i/>
-              </w:rPr>
-              <w:t>VersioningConfiguration</w:t>
-            </w:r>
-            <w:proofErr w:type="spellEnd"/>
-            <w:r>
-              <w:rPr>
-                <w:i/>
-              </w:rPr>
-              <w:t>&gt;</w:t>
+              <w:t>&lt;/VersioningConfiguration&gt;</w:t>
             </w:r>
           </w:p>
         </w:tc>
@@ -5377,21 +4964,7 @@
               <w:rPr>
                 <w:i/>
               </w:rPr>
-              <w:t>&lt;</w:t>
-            </w:r>
-            <w:proofErr w:type="spellStart"/>
-            <w:r>
-              <w:rPr>
-                <w:i/>
-              </w:rPr>
-              <w:t>VersioningConfiguration</w:t>
-            </w:r>
-            <w:proofErr w:type="spellEnd"/>
-            <w:r>
-              <w:rPr>
-                <w:i/>
-              </w:rPr>
-              <w:t>/&gt;</w:t>
+              <w:t>&lt;VersioningConfiguration/&gt;</w:t>
             </w:r>
           </w:p>
         </w:tc>
@@ -5472,11 +5045,9 @@
             <w:pPr>
               <w:ind w:left="0"/>
             </w:pPr>
-            <w:proofErr w:type="spellStart"/>
             <w:r>
               <w:t>listBuckets</w:t>
             </w:r>
-            <w:proofErr w:type="spellEnd"/>
           </w:p>
           <w:p>
             <w:pPr>
@@ -5630,6 +5201,7 @@
               <w:ind w:left="0"/>
             </w:pPr>
             <w:r>
+              <w:lastRenderedPageBreak/>
               <w:t>String nam</w:t>
             </w:r>
             <w:r>
@@ -5644,29 +5216,16 @@
               <w:ind w:left="0"/>
             </w:pPr>
             <w:r>
-              <w:t xml:space="preserve">Owner </w:t>
-            </w:r>
-            <w:proofErr w:type="spellStart"/>
-            <w:r>
-              <w:t>owner</w:t>
-            </w:r>
-            <w:proofErr w:type="spellEnd"/>
-          </w:p>
-          <w:p>
-            <w:pPr>
-              <w:ind w:left="0"/>
-              <w:rPr>
-                <w:rFonts w:hint="eastAsia"/>
-              </w:rPr>
-            </w:pPr>
-            <w:r>
-              <w:t xml:space="preserve">Date </w:t>
-            </w:r>
-            <w:proofErr w:type="spellStart"/>
-            <w:r>
-              <w:t>creationDate</w:t>
-            </w:r>
-            <w:proofErr w:type="spellEnd"/>
+              <w:t>Owner owner</w:t>
+            </w:r>
+          </w:p>
+          <w:p>
+            <w:pPr>
+              <w:ind w:left="0"/>
+            </w:pPr>
+            <w:r>
+              <w:t>Date creationDate</w:t>
+            </w:r>
           </w:p>
         </w:tc>
         <w:tc>
@@ -5681,27 +5240,14 @@
               <w:rPr>
                 <w:rFonts w:hint="eastAsia"/>
               </w:rPr>
-              <w:t>存储</w:t>
-            </w:r>
-            <w:proofErr w:type="gramStart"/>
-            <w:r>
-              <w:rPr>
-                <w:rFonts w:hint="eastAsia"/>
-              </w:rPr>
-              <w:t>桶信息</w:t>
-            </w:r>
-            <w:proofErr w:type="gramEnd"/>
+              <w:lastRenderedPageBreak/>
+              <w:t>存储桶信息</w:t>
+            </w:r>
           </w:p>
         </w:tc>
       </w:tr>
     </w:tbl>
-    <w:p>
-      <w:pPr>
-        <w:rPr>
-          <w:rFonts w:hint="eastAsia"/>
-        </w:rPr>
-      </w:pPr>
-    </w:p>
+    <w:p/>
     <w:p>
       <w:pPr>
         <w:pStyle w:val="3"/>
@@ -5768,11 +5314,9 @@
             <w:pPr>
               <w:ind w:left="0"/>
             </w:pPr>
-            <w:proofErr w:type="spellStart"/>
             <w:r>
               <w:t>createBucket</w:t>
             </w:r>
-            <w:proofErr w:type="spellEnd"/>
           </w:p>
           <w:p>
             <w:pPr>
@@ -5784,11 +5328,9 @@
               </w:rPr>
               <w:t>参数：</w:t>
             </w:r>
-            <w:proofErr w:type="spellStart"/>
             <w:r>
               <w:t>CreateBucketRequest</w:t>
             </w:r>
-            <w:proofErr w:type="spellEnd"/>
           </w:p>
           <w:p>
             <w:pPr>
@@ -5893,11 +5435,9 @@
             <w:pPr>
               <w:ind w:left="0"/>
             </w:pPr>
-            <w:proofErr w:type="spellStart"/>
             <w:r>
               <w:t>CreateBucketRequest</w:t>
             </w:r>
-            <w:proofErr w:type="spellEnd"/>
           </w:p>
           <w:p>
             <w:pPr>
@@ -5915,16 +5455,7 @@
               <w:ind w:left="0"/>
             </w:pPr>
             <w:r>
-              <w:lastRenderedPageBreak/>
-              <w:t xml:space="preserve">String </w:t>
-            </w:r>
-            <w:proofErr w:type="spellStart"/>
-            <w:r>
-              <w:t>bucketName</w:t>
-            </w:r>
-            <w:proofErr w:type="spellEnd"/>
-            <w:r>
-              <w:t xml:space="preserve">, </w:t>
+              <w:t xml:space="preserve">String bucketName, </w:t>
             </w:r>
             <w:r>
               <w:rPr>
@@ -5977,7 +5508,6 @@
               <w:rPr>
                 <w:rFonts w:hint="eastAsia"/>
               </w:rPr>
-              <w:lastRenderedPageBreak/>
               <w:t>构造</w:t>
             </w:r>
             <w:r>
@@ -6033,40 +5563,14 @@
             <w:pPr>
               <w:ind w:left="0"/>
             </w:pPr>
-            <w:proofErr w:type="spellStart"/>
-            <w:r>
-              <w:t>CreateBucketRequest</w:t>
-            </w:r>
-            <w:proofErr w:type="spellEnd"/>
-            <w:r>
-              <w:t xml:space="preserve"> request = new </w:t>
-            </w:r>
-            <w:proofErr w:type="spellStart"/>
-            <w:r>
-              <w:t>CreateBucketRequest</w:t>
-            </w:r>
-            <w:proofErr w:type="spellEnd"/>
-            <w:r>
-              <w:t>(</w:t>
-            </w:r>
-            <w:proofErr w:type="spellStart"/>
-            <w:r>
-              <w:t>bucket,"region</w:t>
-            </w:r>
-            <w:proofErr w:type="spellEnd"/>
-            <w:r>
-              <w:t>");</w:t>
-            </w:r>
-          </w:p>
-          <w:p>
-            <w:pPr>
-              <w:ind w:left="0"/>
-              <w:rPr>
-                <w:rFonts w:hint="eastAsia"/>
-              </w:rPr>
-            </w:pPr>
-            <w:bookmarkStart w:id="3" w:name="_GoBack"/>
-            <w:bookmarkEnd w:id="3"/>
+            <w:r>
+              <w:t>CreateBucketRequest request = new CreateBucketRequest(bucket,"region");</w:t>
+            </w:r>
+          </w:p>
+          <w:p>
+            <w:pPr>
+              <w:ind w:left="0"/>
+            </w:pPr>
             <w:r>
               <w:t>Bucket result = amazonS3.createBucket(request);</w:t>
             </w:r>
@@ -6077,9 +5581,6 @@
     <w:p>
       <w:pPr>
         <w:ind w:left="0"/>
-        <w:rPr>
-          <w:rFonts w:hint="eastAsia"/>
-        </w:rPr>
       </w:pPr>
     </w:p>
     <w:p>
@@ -6145,11 +5646,9 @@
             <w:pPr>
               <w:ind w:left="0"/>
             </w:pPr>
-            <w:proofErr w:type="spellStart"/>
             <w:r>
               <w:t>deleteBucket</w:t>
             </w:r>
-            <w:proofErr w:type="spellEnd"/>
           </w:p>
           <w:p>
             <w:pPr>
@@ -6176,13 +5675,7 @@
               <w:rPr>
                 <w:rFonts w:hint="eastAsia"/>
               </w:rPr>
-              <w:t>返回值：</w:t>
-            </w:r>
-            <w:r>
-              <w:rPr>
-                <w:rFonts w:hint="eastAsia"/>
-              </w:rPr>
-              <w:t>无</w:t>
+              <w:t>返回值：无</w:t>
             </w:r>
           </w:p>
         </w:tc>
@@ -6207,10 +5700,7 @@
               <w:t>delete</w:t>
             </w:r>
             <w:r>
-              <w:t xml:space="preserve"> </w:t>
-            </w:r>
-            <w:r>
-              <w:t>bucket</w:t>
+              <w:t xml:space="preserve"> bucket</w:t>
             </w:r>
             <w:r>
               <w:rPr>
@@ -6256,32 +5746,292 @@
             <w:pPr>
               <w:ind w:left="0"/>
             </w:pPr>
-            <w:proofErr w:type="spellStart"/>
-            <w:r>
-              <w:t>DeleteBucketRequest</w:t>
-            </w:r>
-            <w:proofErr w:type="spellEnd"/>
-            <w:r>
-              <w:t xml:space="preserve"> request = new </w:t>
-            </w:r>
-            <w:proofErr w:type="spellStart"/>
-            <w:r>
-              <w:t>DeleteBucketRequest</w:t>
-            </w:r>
-            <w:proofErr w:type="spellEnd"/>
-            <w:r>
-              <w:t>(bucket);</w:t>
-            </w:r>
-          </w:p>
-          <w:p>
-            <w:pPr>
-              <w:ind w:left="0"/>
-              <w:rPr>
-                <w:rFonts w:hint="eastAsia"/>
-              </w:rPr>
+            <w:r>
+              <w:t>DeleteBucketRequest request = new DeleteBucketRequest(bucket);</w:t>
+            </w:r>
+          </w:p>
+          <w:p>
+            <w:pPr>
+              <w:ind w:left="0"/>
             </w:pPr>
             <w:r>
               <w:t>amazonS3.deleteBucket(request);</w:t>
+            </w:r>
+          </w:p>
+        </w:tc>
+      </w:tr>
+    </w:tbl>
+    <w:p>
+      <w:pPr>
+        <w:ind w:left="0"/>
+      </w:pPr>
+    </w:p>
+    <w:p>
+      <w:pPr>
+        <w:pStyle w:val="3"/>
+        <w:ind w:left="210"/>
+        <w:rPr>
+          <w:rFonts w:hint="eastAsia"/>
+        </w:rPr>
+      </w:pPr>
+      <w:r>
+        <w:rPr>
+          <w:rFonts w:hint="eastAsia"/>
+        </w:rPr>
+        <w:t>HEAD Bucket</w:t>
+      </w:r>
+    </w:p>
+    <w:p>
+      <w:pPr>
+        <w:ind w:left="0"/>
+      </w:pPr>
+      <w:r>
+        <w:rPr>
+          <w:rFonts w:hint="eastAsia"/>
+        </w:rPr>
+        <w:t xml:space="preserve">    </w:t>
+      </w:r>
+    </w:p>
+    <w:tbl>
+      <w:tblPr>
+        <w:tblStyle w:val="a9"/>
+        <w:tblW w:w="0" w:type="auto"/>
+        <w:tblLook w:val="04A0" w:firstRow="1" w:lastRow="0" w:firstColumn="1" w:lastColumn="0" w:noHBand="0" w:noVBand="1"/>
+      </w:tblPr>
+      <w:tblGrid>
+        <w:gridCol w:w="4148"/>
+        <w:gridCol w:w="4148"/>
+      </w:tblGrid>
+      <w:tr>
+        <w:tc>
+          <w:tcPr>
+            <w:tcW w:w="4148" w:type="dxa"/>
+          </w:tcPr>
+          <w:p>
+            <w:pPr>
+              <w:ind w:left="0"/>
+              <w:rPr>
+                <w:rFonts w:hint="eastAsia"/>
+              </w:rPr>
+            </w:pPr>
+            <w:r>
+              <w:rPr>
+                <w:rFonts w:hint="eastAsia"/>
+              </w:rPr>
+              <w:t>接口</w:t>
+            </w:r>
+          </w:p>
+        </w:tc>
+        <w:tc>
+          <w:tcPr>
+            <w:tcW w:w="4148" w:type="dxa"/>
+          </w:tcPr>
+          <w:p>
+            <w:pPr>
+              <w:ind w:left="0"/>
+              <w:rPr>
+                <w:rFonts w:hint="eastAsia"/>
+              </w:rPr>
+            </w:pPr>
+            <w:r>
+              <w:rPr>
+                <w:rFonts w:hint="eastAsia"/>
+              </w:rPr>
+              <w:t>作用</w:t>
+            </w:r>
+          </w:p>
+        </w:tc>
+      </w:tr>
+      <w:tr>
+        <w:tc>
+          <w:tcPr>
+            <w:tcW w:w="4148" w:type="dxa"/>
+          </w:tcPr>
+          <w:p>
+            <w:pPr>
+              <w:ind w:left="0"/>
+            </w:pPr>
+            <w:r>
+              <w:lastRenderedPageBreak/>
+              <w:t>doesBucketExist</w:t>
+            </w:r>
+          </w:p>
+          <w:p>
+            <w:pPr>
+              <w:ind w:left="0"/>
+            </w:pPr>
+            <w:r>
+              <w:rPr>
+                <w:rFonts w:hint="eastAsia"/>
+              </w:rPr>
+              <w:t>参数：</w:t>
+            </w:r>
+            <w:r>
+              <w:t>String</w:t>
+            </w:r>
+            <w:r>
+              <w:t xml:space="preserve"> bucketname</w:t>
+            </w:r>
+          </w:p>
+          <w:p>
+            <w:pPr>
+              <w:ind w:left="0"/>
+              <w:rPr>
+                <w:rFonts w:hint="eastAsia"/>
+              </w:rPr>
+            </w:pPr>
+            <w:r>
+              <w:rPr>
+                <w:rFonts w:hint="eastAsia"/>
+              </w:rPr>
+              <w:t>返回值：</w:t>
+            </w:r>
+            <w:r>
+              <w:rPr>
+                <w:rFonts w:hint="eastAsia"/>
+              </w:rPr>
+              <w:t>true</w:t>
+            </w:r>
+            <w:r>
+              <w:t>/false</w:t>
+            </w:r>
+          </w:p>
+        </w:tc>
+        <w:tc>
+          <w:tcPr>
+            <w:tcW w:w="4148" w:type="dxa"/>
+          </w:tcPr>
+          <w:p>
+            <w:pPr>
+              <w:ind w:left="0"/>
+              <w:rPr>
+                <w:rFonts w:hint="eastAsia"/>
+              </w:rPr>
+            </w:pPr>
+            <w:r>
+              <w:rPr>
+                <w:rFonts w:hint="eastAsia"/>
+              </w:rPr>
+              <w:t>发送</w:t>
+            </w:r>
+            <w:r>
+              <w:rPr>
+                <w:rFonts w:hint="eastAsia"/>
+              </w:rPr>
+              <w:t>HEAD</w:t>
+            </w:r>
+            <w:r>
+              <w:t xml:space="preserve"> </w:t>
+            </w:r>
+            <w:r>
+              <w:rPr>
+                <w:rFonts w:hint="eastAsia"/>
+              </w:rPr>
+              <w:t>Bucket</w:t>
+            </w:r>
+            <w:r>
+              <w:rPr>
+                <w:rFonts w:hint="eastAsia"/>
+              </w:rPr>
+              <w:t>请求并处理响应，如果收到</w:t>
+            </w:r>
+            <w:r>
+              <w:rPr>
+                <w:rFonts w:hint="eastAsia"/>
+              </w:rPr>
+              <w:t>200</w:t>
+            </w:r>
+            <w:r>
+              <w:rPr>
+                <w:rFonts w:hint="eastAsia"/>
+              </w:rPr>
+              <w:t>返回</w:t>
+            </w:r>
+            <w:r>
+              <w:rPr>
+                <w:rFonts w:hint="eastAsia"/>
+              </w:rPr>
+              <w:t>true</w:t>
+            </w:r>
+            <w:r>
+              <w:rPr>
+                <w:rFonts w:hint="eastAsia"/>
+              </w:rPr>
+              <w:t>，如果收到</w:t>
+            </w:r>
+            <w:r>
+              <w:rPr>
+                <w:rFonts w:hint="eastAsia"/>
+              </w:rPr>
+              <w:t>404</w:t>
+            </w:r>
+            <w:r>
+              <w:rPr>
+                <w:rFonts w:hint="eastAsia"/>
+              </w:rPr>
+              <w:t>返回</w:t>
+            </w:r>
+            <w:r>
+              <w:rPr>
+                <w:rFonts w:hint="eastAsia"/>
+              </w:rPr>
+              <w:t>false</w:t>
+            </w:r>
+            <w:r>
+              <w:rPr>
+                <w:rFonts w:hint="eastAsia"/>
+              </w:rPr>
+              <w:t>，其他状态码抛出异常</w:t>
+            </w:r>
+          </w:p>
+        </w:tc>
+      </w:tr>
+    </w:tbl>
+    <w:p>
+      <w:pPr>
+        <w:ind w:left="0"/>
+      </w:pPr>
+    </w:p>
+    <w:p>
+      <w:pPr>
+        <w:ind w:left="0"/>
+      </w:pPr>
+      <w:r>
+        <w:rPr>
+          <w:rFonts w:hint="eastAsia"/>
+        </w:rPr>
+        <w:t>样例：</w:t>
+      </w:r>
+    </w:p>
+    <w:tbl>
+      <w:tblPr>
+        <w:tblStyle w:val="a9"/>
+        <w:tblW w:w="0" w:type="auto"/>
+        <w:tblLook w:val="04A0" w:firstRow="1" w:lastRow="0" w:firstColumn="1" w:lastColumn="0" w:noHBand="0" w:noVBand="1"/>
+      </w:tblPr>
+      <w:tblGrid>
+        <w:gridCol w:w="8296"/>
+      </w:tblGrid>
+      <w:tr>
+        <w:tc>
+          <w:tcPr>
+            <w:tcW w:w="8296" w:type="dxa"/>
+          </w:tcPr>
+          <w:p>
+            <w:pPr>
+              <w:ind w:left="0"/>
+              <w:rPr>
+                <w:rFonts w:hint="eastAsia"/>
+              </w:rPr>
+            </w:pPr>
+            <w:r>
+              <w:t>amazonS3.doesBucketExist(</w:t>
+            </w:r>
+            <w:r>
+              <w:t>“bucketname”</w:t>
+            </w:r>
+            <w:r>
+              <w:t>);</w:t>
             </w:r>
           </w:p>
         </w:tc>
@@ -6358,11 +6108,9 @@
             <w:pPr>
               <w:ind w:left="0"/>
             </w:pPr>
-            <w:proofErr w:type="spellStart"/>
             <w:r>
               <w:t>setBucketVersioningConfiguration</w:t>
             </w:r>
-            <w:proofErr w:type="spellEnd"/>
           </w:p>
           <w:p>
             <w:pPr>
@@ -6374,11 +6122,9 @@
               </w:rPr>
               <w:t>参数：</w:t>
             </w:r>
-            <w:proofErr w:type="spellStart"/>
             <w:r>
               <w:t>SetBucketVersioningConfigurationRequest</w:t>
             </w:r>
-            <w:proofErr w:type="spellEnd"/>
           </w:p>
           <w:p>
             <w:pPr>
@@ -6474,11 +6220,9 @@
             <w:pPr>
               <w:ind w:left="0"/>
             </w:pPr>
-            <w:proofErr w:type="spellStart"/>
             <w:r>
               <w:t>SetBucketVersioningConfigurationRequest</w:t>
             </w:r>
-            <w:proofErr w:type="spellEnd"/>
           </w:p>
           <w:p>
             <w:pPr>
@@ -6506,13 +6250,8 @@
             <w:pPr>
               <w:ind w:left="0"/>
             </w:pPr>
-            <w:proofErr w:type="spellStart"/>
-            <w:r>
-              <w:t>BucketVersioningConfiguration</w:t>
-            </w:r>
-            <w:proofErr w:type="spellEnd"/>
-            <w:r>
-              <w:t xml:space="preserve"> configuration</w:t>
+            <w:r>
+              <w:t>BucketVersioningConfiguration configuration</w:t>
             </w:r>
           </w:p>
           <w:p>
@@ -6609,11 +6348,9 @@
             <w:pPr>
               <w:ind w:left="0"/>
             </w:pPr>
-            <w:proofErr w:type="spellStart"/>
             <w:r>
               <w:t>BucketVersioningConfiguration</w:t>
             </w:r>
-            <w:proofErr w:type="spellEnd"/>
           </w:p>
           <w:p>
             <w:pPr>
@@ -6716,46 +6453,16 @@
             <w:pPr>
               <w:ind w:left="0"/>
             </w:pPr>
-            <w:proofErr w:type="spellStart"/>
-            <w:r>
-              <w:lastRenderedPageBreak/>
-              <w:t>BucketVersioningConfiguration</w:t>
-            </w:r>
-            <w:proofErr w:type="spellEnd"/>
-            <w:r>
-              <w:t xml:space="preserve"> </w:t>
-            </w:r>
-            <w:proofErr w:type="spellStart"/>
-            <w:r>
-              <w:t>cfg</w:t>
-            </w:r>
-            <w:proofErr w:type="spellEnd"/>
-            <w:r>
-              <w:t xml:space="preserve"> = new </w:t>
-            </w:r>
-            <w:proofErr w:type="spellStart"/>
-            <w:r>
-              <w:t>BucketVersioningConfiguration</w:t>
-            </w:r>
-            <w:proofErr w:type="spellEnd"/>
-            <w:r>
-              <w:t>(status);</w:t>
-            </w:r>
-          </w:p>
-          <w:p>
-            <w:pPr>
-              <w:ind w:left="0"/>
-            </w:pPr>
-            <w:proofErr w:type="spellStart"/>
-            <w:r>
-              <w:t>SetBucketVersioningConfigurationRequest</w:t>
-            </w:r>
-            <w:proofErr w:type="spellEnd"/>
-            <w:r>
-              <w:t xml:space="preserve"> </w:t>
-            </w:r>
-            <w:r>
-              <w:t xml:space="preserve">request = </w:t>
+            <w:r>
+              <w:t>BucketVersioningConfiguration cfg = new BucketVersioningConfiguration(status);</w:t>
+            </w:r>
+          </w:p>
+          <w:p>
+            <w:pPr>
+              <w:ind w:left="0"/>
+            </w:pPr>
+            <w:r>
+              <w:t xml:space="preserve">SetBucketVersioningConfigurationRequest request = </w:t>
             </w:r>
           </w:p>
           <w:p>
@@ -6763,36 +6470,12 @@
               <w:ind w:left="0" w:firstLineChars="1400" w:firstLine="2940"/>
             </w:pPr>
             <w:r>
-              <w:t xml:space="preserve">new </w:t>
-            </w:r>
-            <w:proofErr w:type="spellStart"/>
-            <w:proofErr w:type="gramStart"/>
-            <w:r>
-              <w:t>SetBucketVersioningConfigurationRequest</w:t>
-            </w:r>
-            <w:proofErr w:type="spellEnd"/>
-            <w:r>
-              <w:t>(</w:t>
-            </w:r>
-            <w:proofErr w:type="gramEnd"/>
-            <w:r>
-              <w:t xml:space="preserve">bucket, </w:t>
-            </w:r>
-            <w:proofErr w:type="spellStart"/>
-            <w:r>
-              <w:t>cfg</w:t>
-            </w:r>
-            <w:proofErr w:type="spellEnd"/>
-            <w:r>
-              <w:t>);</w:t>
-            </w:r>
-          </w:p>
-          <w:p>
-            <w:pPr>
-              <w:ind w:left="0"/>
-              <w:rPr>
-                <w:rFonts w:hint="eastAsia"/>
-              </w:rPr>
+              <w:t>new SetBucketVersioningConfigurationRequest(bucket, cfg);</w:t>
+            </w:r>
+          </w:p>
+          <w:p>
+            <w:pPr>
+              <w:ind w:left="0"/>
             </w:pPr>
             <w:r>
               <w:t>amazonS3.setBucketVersioningConfiguration(request);</w:t>
@@ -6804,9 +6487,6 @@
     <w:p>
       <w:pPr>
         <w:ind w:left="0"/>
-        <w:rPr>
-          <w:rFonts w:hint="eastAsia"/>
-        </w:rPr>
       </w:pPr>
     </w:p>
     <w:p>
@@ -6872,11 +6552,9 @@
             <w:pPr>
               <w:ind w:left="0"/>
             </w:pPr>
-            <w:proofErr w:type="spellStart"/>
             <w:r>
               <w:t>getBucketVersioningConfiguration</w:t>
             </w:r>
-            <w:proofErr w:type="spellEnd"/>
           </w:p>
           <w:p>
             <w:pPr>
@@ -6911,11 +6589,9 @@
             <w:r>
               <w:t xml:space="preserve"> </w:t>
             </w:r>
-            <w:proofErr w:type="spellStart"/>
             <w:r>
               <w:t>BucketVersioningConfiguration</w:t>
             </w:r>
-            <w:proofErr w:type="spellEnd"/>
           </w:p>
         </w:tc>
         <w:tc>
@@ -6967,6 +6643,7 @@
         <w:rPr>
           <w:rFonts w:hint="eastAsia"/>
         </w:rPr>
+        <w:lastRenderedPageBreak/>
         <w:t>样例：</w:t>
       </w:r>
     </w:p>
@@ -6987,17 +6664,9 @@
           <w:p>
             <w:pPr>
               <w:ind w:left="0"/>
-              <w:rPr>
-                <w:rFonts w:hint="eastAsia"/>
-              </w:rPr>
-            </w:pPr>
-            <w:proofErr w:type="spellStart"/>
-            <w:r>
-              <w:t>BucketVersioningConfiguration</w:t>
-            </w:r>
-            <w:proofErr w:type="spellEnd"/>
-            <w:r>
-              <w:t xml:space="preserve"> result = amazonS3.getBucketVersioningConfiguration(bucket);</w:t>
+            </w:pPr>
+            <w:r>
+              <w:t>BucketVersioningConfiguration result = amazonS3.getBucketVersioningConfiguration(bucket);</w:t>
             </w:r>
           </w:p>
         </w:tc>
@@ -7006,9 +6675,6 @@
     <w:p>
       <w:pPr>
         <w:ind w:left="0"/>
-        <w:rPr>
-          <w:rFonts w:hint="eastAsia"/>
-        </w:rPr>
       </w:pPr>
     </w:p>
     <w:p>
@@ -7117,57 +6783,35 @@
         </w:rPr>
         <w:t>—</w:t>
       </w:r>
-      <w:proofErr w:type="spellStart"/>
       <w:r>
         <w:rPr>
           <w:rFonts w:asciiTheme="minorEastAsia" w:hAnsiTheme="minorEastAsia" w:hint="eastAsia"/>
         </w:rPr>
-        <w:t>SequoiaDB</w:t>
-      </w:r>
-      <w:proofErr w:type="spellEnd"/>
+        <w:t>SequoiaDB兼容Amazon</w:t>
+      </w:r>
+      <w:r>
+        <w:rPr>
+          <w:rFonts w:asciiTheme="minorEastAsia" w:hAnsiTheme="minorEastAsia"/>
+        </w:rPr>
+        <w:t xml:space="preserve"> </w:t>
+      </w:r>
       <w:r>
         <w:rPr>
           <w:rFonts w:asciiTheme="minorEastAsia" w:hAnsiTheme="minorEastAsia" w:hint="eastAsia"/>
         </w:rPr>
-        <w:t>兼容Amazon</w:t>
+        <w:t>S</w:t>
       </w:r>
       <w:r>
         <w:rPr>
           <w:rFonts w:asciiTheme="minorEastAsia" w:hAnsiTheme="minorEastAsia"/>
         </w:rPr>
-        <w:t xml:space="preserve"> </w:t>
+        <w:t>3</w:t>
       </w:r>
       <w:r>
         <w:rPr>
           <w:rFonts w:asciiTheme="minorEastAsia" w:hAnsiTheme="minorEastAsia" w:hint="eastAsia"/>
         </w:rPr>
-        <w:t>S</w:t>
-      </w:r>
-      <w:r>
-        <w:rPr>
-          <w:rFonts w:asciiTheme="minorEastAsia" w:hAnsiTheme="minorEastAsia"/>
-        </w:rPr>
-        <w:t>3</w:t>
-      </w:r>
-      <w:r>
-        <w:rPr>
-          <w:rFonts w:asciiTheme="minorEastAsia" w:hAnsiTheme="minorEastAsia" w:hint="eastAsia"/>
-        </w:rPr>
-        <w:t>接口.</w:t>
-      </w:r>
-      <w:proofErr w:type="spellStart"/>
-      <w:r>
-        <w:rPr>
-          <w:rFonts w:asciiTheme="minorEastAsia" w:hAnsiTheme="minorEastAsia" w:hint="eastAsia"/>
-        </w:rPr>
-        <w:t>docx</w:t>
-      </w:r>
-      <w:proofErr w:type="spellEnd"/>
-      <w:r>
-        <w:rPr>
-          <w:rFonts w:asciiTheme="minorEastAsia" w:hAnsiTheme="minorEastAsia" w:hint="eastAsia"/>
-        </w:rPr>
-        <w:t>》。</w:t>
+        <w:t>接口.docx》。</w:t>
       </w:r>
     </w:p>
     <w:p>
@@ -7251,23 +6895,7 @@
           <w:rFonts w:hint="eastAsia"/>
           <w:color w:val="00B0F0"/>
         </w:rPr>
-        <w:t>使用时序</w:t>
-      </w:r>
-      <w:proofErr w:type="gramStart"/>
-      <w:r>
-        <w:rPr>
-          <w:rFonts w:hint="eastAsia"/>
-          <w:color w:val="00B0F0"/>
-        </w:rPr>
-        <w:t>图或者</w:t>
-      </w:r>
-      <w:proofErr w:type="gramEnd"/>
-      <w:r>
-        <w:rPr>
-          <w:rFonts w:hint="eastAsia"/>
-          <w:color w:val="00B0F0"/>
-        </w:rPr>
-        <w:t>活动图</w:t>
+        <w:t>使用时序图或者活动图</w:t>
       </w:r>
       <w:r>
         <w:rPr>
@@ -7467,7 +7095,6 @@
               <w:rPr>
                 <w:rFonts w:hint="eastAsia"/>
               </w:rPr>
-              <w:lastRenderedPageBreak/>
               <w:t>GET</w:t>
             </w:r>
           </w:p>
@@ -8144,17 +7771,18 @@
         <w:pStyle w:val="3"/>
         <w:ind w:left="210"/>
       </w:pPr>
-      <w:bookmarkStart w:id="4" w:name="_获取桶列表（GET_Service）"/>
-      <w:bookmarkStart w:id="5" w:name="_权限校验流程"/>
-      <w:bookmarkStart w:id="6" w:name="_创建用户（PUT_User）"/>
-      <w:bookmarkStart w:id="7" w:name="_Ref517361379"/>
+      <w:bookmarkStart w:id="3" w:name="_获取桶列表（GET_Service）"/>
+      <w:bookmarkStart w:id="4" w:name="_权限校验流程"/>
+      <w:bookmarkStart w:id="5" w:name="_创建用户（PUT_User）"/>
+      <w:bookmarkStart w:id="6" w:name="_Ref517361379"/>
+      <w:bookmarkEnd w:id="3"/>
       <w:bookmarkEnd w:id="4"/>
       <w:bookmarkEnd w:id="5"/>
-      <w:bookmarkEnd w:id="6"/>
-      <w:r>
-        <w:rPr>
-          <w:rFonts w:hint="eastAsia"/>
-        </w:rPr>
+      <w:r>
+        <w:rPr>
+          <w:rFonts w:hint="eastAsia"/>
+        </w:rPr>
+        <w:lastRenderedPageBreak/>
         <w:t>获取桶列表（</w:t>
       </w:r>
       <w:r>
@@ -8171,8 +7799,8 @@
       <w:pPr>
         <w:ind w:left="0"/>
       </w:pPr>
-      <w:bookmarkStart w:id="8" w:name="_创建桶（PUT_Bucket）"/>
-      <w:bookmarkEnd w:id="8"/>
+      <w:bookmarkStart w:id="7" w:name="_创建桶（PUT_Bucket）"/>
+      <w:bookmarkEnd w:id="7"/>
       <w:r>
         <w:rPr>
           <w:rFonts w:hint="eastAsia"/>
@@ -8337,14 +7965,12 @@
         </w:rPr>
         <w:t>每次写入一条新纪录之前都查询当前</w:t>
       </w:r>
-      <w:proofErr w:type="spellStart"/>
       <w:r>
         <w:rPr>
           <w:rFonts w:hint="eastAsia"/>
         </w:rPr>
         <w:t>bucketlist</w:t>
       </w:r>
-      <w:proofErr w:type="spellEnd"/>
       <w:r>
         <w:rPr>
           <w:rFonts w:hint="eastAsia"/>
@@ -8598,11 +8224,9 @@
         </w:rPr>
         <w:t>，返回</w:t>
       </w:r>
-      <w:proofErr w:type="spellStart"/>
       <w:r>
         <w:t>InvalidBucketName</w:t>
       </w:r>
-      <w:proofErr w:type="spellEnd"/>
       <w:r>
         <w:rPr>
           <w:rFonts w:hint="eastAsia"/>
@@ -8644,11 +8268,9 @@
         </w:rPr>
         <w:t>，均返回</w:t>
       </w:r>
-      <w:proofErr w:type="spellStart"/>
       <w:r>
         <w:t>InvalidBucketName</w:t>
       </w:r>
-      <w:proofErr w:type="spellEnd"/>
     </w:p>
     <w:p>
       <w:pPr>
@@ -8660,19 +8282,11 @@
         <w:spacing w:beforeLines="50" w:before="156" w:afterLines="50" w:after="156"/>
         <w:ind w:firstLineChars="0"/>
       </w:pPr>
-      <w:proofErr w:type="gramStart"/>
-      <w:r>
-        <w:rPr>
-          <w:rFonts w:hint="eastAsia"/>
-        </w:rPr>
-        <w:t>桶已经</w:t>
-      </w:r>
-      <w:proofErr w:type="gramEnd"/>
-      <w:r>
-        <w:rPr>
-          <w:rFonts w:hint="eastAsia"/>
-        </w:rPr>
-        <w:t>存在，属于其他</w:t>
+      <w:r>
+        <w:rPr>
+          <w:rFonts w:hint="eastAsia"/>
+        </w:rPr>
+        <w:t>桶已经存在，属于其他</w:t>
       </w:r>
       <w:r>
         <w:rPr>
@@ -8686,11 +8300,9 @@
         </w:rPr>
         <w:t>，返回</w:t>
       </w:r>
-      <w:proofErr w:type="spellStart"/>
       <w:r>
         <w:t>BucketAlreadyExists</w:t>
       </w:r>
-      <w:proofErr w:type="spellEnd"/>
       <w:r>
         <w:rPr>
           <w:rFonts w:hint="eastAsia"/>
@@ -8708,25 +8320,15 @@
         <w:spacing w:beforeLines="50" w:before="156" w:afterLines="50" w:after="156"/>
         <w:ind w:firstLineChars="0"/>
       </w:pPr>
-      <w:proofErr w:type="gramStart"/>
-      <w:r>
-        <w:rPr>
-          <w:rFonts w:hint="eastAsia"/>
-        </w:rPr>
-        <w:t>桶已经</w:t>
-      </w:r>
-      <w:proofErr w:type="gramEnd"/>
-      <w:r>
-        <w:rPr>
-          <w:rFonts w:hint="eastAsia"/>
-        </w:rPr>
-        <w:t>存在，属于自己，返回</w:t>
-      </w:r>
-      <w:proofErr w:type="spellStart"/>
+      <w:r>
+        <w:rPr>
+          <w:rFonts w:hint="eastAsia"/>
+        </w:rPr>
+        <w:t>桶已经存在，属于自己，返回</w:t>
+      </w:r>
       <w:r>
         <w:t>BucketAlreadyOwnedByYou</w:t>
       </w:r>
-      <w:proofErr w:type="spellEnd"/>
       <w:r>
         <w:rPr>
           <w:rFonts w:hint="eastAsia"/>
@@ -8884,49 +8486,19 @@
         <w:rPr>
           <w:rFonts w:hint="eastAsia"/>
         </w:rPr>
-        <w:t>指定的</w:t>
-      </w:r>
-      <w:proofErr w:type="gramStart"/>
-      <w:r>
-        <w:rPr>
-          <w:rFonts w:hint="eastAsia"/>
-        </w:rPr>
-        <w:t>桶已经</w:t>
-      </w:r>
-      <w:proofErr w:type="gramEnd"/>
-      <w:r>
-        <w:rPr>
-          <w:rFonts w:hint="eastAsia"/>
-        </w:rPr>
-        <w:t>没有对象记录，删除</w:t>
-      </w:r>
-      <w:proofErr w:type="spellStart"/>
+        <w:t>指定的桶已经没有对象记录，删除</w:t>
+      </w:r>
       <w:r>
         <w:rPr>
           <w:rFonts w:hint="eastAsia"/>
         </w:rPr>
         <w:t>BucketList</w:t>
       </w:r>
-      <w:proofErr w:type="spellEnd"/>
-      <w:r>
-        <w:rPr>
-          <w:rFonts w:hint="eastAsia"/>
-        </w:rPr>
-        <w:t>中对应的记录，并删除权限表中</w:t>
-      </w:r>
-      <w:proofErr w:type="gramStart"/>
-      <w:r>
-        <w:rPr>
-          <w:rFonts w:hint="eastAsia"/>
-        </w:rPr>
-        <w:t>关于概该桶</w:t>
-      </w:r>
-      <w:proofErr w:type="gramEnd"/>
-      <w:r>
-        <w:rPr>
-          <w:rFonts w:hint="eastAsia"/>
-        </w:rPr>
-        <w:t>的记录。</w:t>
+      <w:r>
+        <w:rPr>
+          <w:rFonts w:hint="eastAsia"/>
+        </w:rPr>
+        <w:t>中对应的记录，并删除权限表中关于概该桶的记录。</w:t>
       </w:r>
     </w:p>
     <w:p>
@@ -8956,11 +8528,9 @@
         </w:rPr>
         <w:t>桶不存在，返回</w:t>
       </w:r>
-      <w:proofErr w:type="spellStart"/>
       <w:r>
         <w:t>NoSuchBucket</w:t>
       </w:r>
-      <w:proofErr w:type="spellEnd"/>
       <w:r>
         <w:rPr>
           <w:rFonts w:hint="eastAsia"/>
@@ -8984,11 +8554,9 @@
         </w:rPr>
         <w:t>桶不属于请求发起者，返回</w:t>
       </w:r>
-      <w:proofErr w:type="spellStart"/>
       <w:r>
         <w:t>AccessDenied</w:t>
       </w:r>
-      <w:proofErr w:type="spellEnd"/>
       <w:r>
         <w:rPr>
           <w:rFonts w:hint="eastAsia"/>
@@ -9012,18 +8580,16 @@
         </w:rPr>
         <w:t>桶内仍存有对象，返回</w:t>
       </w:r>
-      <w:proofErr w:type="spellStart"/>
       <w:r>
         <w:t>BucketNotEmpty</w:t>
       </w:r>
-      <w:proofErr w:type="spellEnd"/>
       <w:r>
         <w:rPr>
           <w:rFonts w:hint="eastAsia"/>
         </w:rPr>
         <w:t>。</w:t>
       </w:r>
-      <w:bookmarkEnd w:id="7"/>
+      <w:bookmarkEnd w:id="6"/>
     </w:p>
     <w:p>
       <w:pPr>
@@ -9034,35 +8600,235 @@
         <w:rPr>
           <w:rFonts w:hint="eastAsia"/>
         </w:rPr>
-        <w:t>设置版本控制状态（</w:t>
-      </w:r>
-      <w:r>
-        <w:t>PUT Bucket versioning</w:t>
-      </w:r>
-      <w:r>
-        <w:rPr>
-          <w:rFonts w:hint="eastAsia"/>
-        </w:rPr>
-        <w:t>）</w:t>
+        <w:t>HEAD Bucket</w:t>
       </w:r>
     </w:p>
     <w:p>
-      <w:r>
-        <w:rPr>
-          <w:rFonts w:hint="eastAsia"/>
-        </w:rPr>
-        <w:t>设置版本控制参数流程：</w:t>
+      <w:pPr>
+        <w:ind w:left="0" w:firstLine="420"/>
+      </w:pPr>
+      <w:r>
+        <w:rPr>
+          <w:rFonts w:hint="eastAsia"/>
+        </w:rPr>
+        <w:t>查询桶是否存在并且是否允许访问。</w:t>
       </w:r>
     </w:p>
     <w:p>
       <w:pPr>
+        <w:ind w:left="0" w:firstLine="420"/>
+      </w:pPr>
+    </w:p>
+    <w:p>
+      <w:pPr>
+        <w:ind w:left="0" w:firstLine="420"/>
+        <w:rPr>
+          <w:rFonts w:hint="eastAsia"/>
+        </w:rPr>
+      </w:pPr>
+      <w:r>
+        <w:rPr>
+          <w:rFonts w:hint="eastAsia"/>
+        </w:rPr>
+        <w:t>当</w:t>
+      </w:r>
+      <w:r>
+        <w:rPr>
+          <w:rFonts w:hint="eastAsia"/>
+        </w:rPr>
+        <w:t>桶存在并且有权限访问，返回</w:t>
+      </w:r>
+      <w:r>
+        <w:rPr>
+          <w:rFonts w:hint="eastAsia"/>
+        </w:rPr>
+        <w:t>200</w:t>
+      </w:r>
+      <w:r>
+        <w:t xml:space="preserve"> ok .</w:t>
+      </w:r>
+    </w:p>
+    <w:p>
+      <w:pPr>
+        <w:ind w:left="0" w:firstLine="420"/>
+        <w:rPr>
+          <w:rFonts w:hint="eastAsia"/>
+        </w:rPr>
+      </w:pPr>
+      <w:r>
+        <w:rPr>
+          <w:rFonts w:hint="eastAsia"/>
+        </w:rPr>
+        <w:t>当桶不存在，返回</w:t>
+      </w:r>
+      <w:r>
+        <w:rPr>
+          <w:rFonts w:hint="eastAsia"/>
+        </w:rPr>
+        <w:t>404</w:t>
+      </w:r>
+      <w:r>
+        <w:t xml:space="preserve"> Not Found .</w:t>
+      </w:r>
+    </w:p>
+    <w:p>
+      <w:pPr>
+        <w:ind w:left="0" w:firstLine="420"/>
+        <w:rPr>
+          <w:rFonts w:hint="eastAsia"/>
+        </w:rPr>
+      </w:pPr>
+      <w:r>
+        <w:rPr>
+          <w:rFonts w:hint="eastAsia"/>
+        </w:rPr>
+        <w:t>当桶存在，但无权限访问（目前尚未做权限控制，用户均无权限访问其他用户创建的桶），返回</w:t>
+      </w:r>
+      <w:r>
+        <w:rPr>
+          <w:rFonts w:hint="eastAsia"/>
+        </w:rPr>
+        <w:t>403</w:t>
+      </w:r>
+      <w:r>
+        <w:t xml:space="preserve"> Forbidden.</w:t>
+      </w:r>
+    </w:p>
+    <w:p>
+      <w:pPr>
+        <w:rPr>
+          <w:rFonts w:hint="eastAsia"/>
+        </w:rPr>
+      </w:pPr>
+      <w:r>
+        <w:rPr>
+          <w:rFonts w:hint="eastAsia"/>
+        </w:rPr>
+        <w:t>HEAD</w:t>
+      </w:r>
+      <w:r>
+        <w:t xml:space="preserve"> </w:t>
+      </w:r>
+      <w:r>
+        <w:rPr>
+          <w:rFonts w:hint="eastAsia"/>
+        </w:rPr>
+        <w:t>Bucket</w:t>
+      </w:r>
+      <w:r>
+        <w:rPr>
+          <w:rFonts w:hint="eastAsia"/>
+        </w:rPr>
+        <w:t>处理流程</w:t>
+      </w:r>
+      <w:bookmarkStart w:id="8" w:name="_GoBack"/>
+      <w:bookmarkEnd w:id="8"/>
+      <w:r>
+        <w:rPr>
+          <w:rFonts w:hint="eastAsia"/>
+        </w:rPr>
+        <w:t>如下：</w:t>
+      </w:r>
+    </w:p>
+    <w:p>
+      <w:pPr>
+        <w:rPr>
+          <w:rFonts w:hint="eastAsia"/>
+        </w:rPr>
+      </w:pPr>
+      <w:r>
+        <w:rPr>
+          <w:rFonts w:hint="eastAsia"/>
+          <w:noProof/>
+        </w:rPr>
+        <w:lastRenderedPageBreak/>
+        <w:drawing>
+          <wp:inline distT="0" distB="0" distL="0" distR="0" wp14:anchorId="5F57D07D" wp14:editId="37076283">
+            <wp:extent cx="5274310" cy="3052597"/>
+            <wp:effectExtent l="0" t="0" r="2540" b="0"/>
+            <wp:docPr id="2" name="图片 2"/>
+            <wp:cNvGraphicFramePr>
+              <a:graphicFrameLocks xmlns:a="http://schemas.openxmlformats.org/drawingml/2006/main" noChangeAspect="1"/>
+            </wp:cNvGraphicFramePr>
+            <a:graphic xmlns:a="http://schemas.openxmlformats.org/drawingml/2006/main">
+              <a:graphicData uri="http://schemas.openxmlformats.org/drawingml/2006/picture">
+                <pic:pic xmlns:pic="http://schemas.openxmlformats.org/drawingml/2006/picture">
+                  <pic:nvPicPr>
+                    <pic:cNvPr id="0" name="Picture 1"/>
+                    <pic:cNvPicPr>
+                      <a:picLocks noChangeAspect="1" noChangeArrowheads="1"/>
+                    </pic:cNvPicPr>
+                  </pic:nvPicPr>
+                  <pic:blipFill>
+                    <a:blip r:embed="rId13">
+                      <a:extLst>
+                        <a:ext uri="{28A0092B-C50C-407E-A947-70E740481C1C}">
+                          <a14:useLocalDpi xmlns:a14="http://schemas.microsoft.com/office/drawing/2010/main" val="0"/>
+                        </a:ext>
+                      </a:extLst>
+                    </a:blip>
+                    <a:srcRect/>
+                    <a:stretch>
+                      <a:fillRect/>
+                    </a:stretch>
+                  </pic:blipFill>
+                  <pic:spPr bwMode="auto">
+                    <a:xfrm>
+                      <a:off x="0" y="0"/>
+                      <a:ext cx="5274310" cy="3052597"/>
+                    </a:xfrm>
+                    <a:prstGeom prst="rect">
+                      <a:avLst/>
+                    </a:prstGeom>
+                    <a:noFill/>
+                    <a:ln>
+                      <a:noFill/>
+                    </a:ln>
+                  </pic:spPr>
+                </pic:pic>
+              </a:graphicData>
+            </a:graphic>
+          </wp:inline>
+        </w:drawing>
+      </w:r>
+    </w:p>
+    <w:p>
+      <w:pPr>
+        <w:pStyle w:val="3"/>
+        <w:ind w:left="210"/>
+      </w:pPr>
+      <w:r>
+        <w:rPr>
+          <w:rFonts w:hint="eastAsia"/>
+        </w:rPr>
+        <w:t>设置版本控制状态（</w:t>
+      </w:r>
+      <w:r>
+        <w:t>PUT Bucket versioning</w:t>
+      </w:r>
+      <w:r>
+        <w:rPr>
+          <w:rFonts w:hint="eastAsia"/>
+        </w:rPr>
+        <w:t>）</w:t>
+      </w:r>
+    </w:p>
+    <w:p>
+      <w:r>
+        <w:rPr>
+          <w:rFonts w:hint="eastAsia"/>
+        </w:rPr>
+        <w:t>设置版本控制参数流程：</w:t>
+      </w:r>
+    </w:p>
+    <w:p>
+      <w:pPr>
         <w:ind w:left="0" w:firstLineChars="200" w:firstLine="420"/>
       </w:pPr>
       <w:r>
         <w:rPr>
           <w:noProof/>
         </w:rPr>
-        <w:lastRenderedPageBreak/>
         <w:drawing>
           <wp:inline distT="0" distB="0" distL="0" distR="0" wp14:anchorId="79B1DEA9" wp14:editId="37B7EA03">
             <wp:extent cx="5274310" cy="3294185"/>
@@ -9081,7 +8847,7 @@
                     </pic:cNvPicPr>
                   </pic:nvPicPr>
                   <pic:blipFill>
-                    <a:blip r:embed="rId13">
+                    <a:blip r:embed="rId14">
                       <a:extLst>
                         <a:ext uri="{28A0092B-C50C-407E-A947-70E740481C1C}">
                           <a14:useLocalDpi xmlns:a14="http://schemas.microsoft.com/office/drawing/2010/main" val="0"/>
@@ -9207,11 +8973,9 @@
         </w:rPr>
         <w:t>桶不存在，返回</w:t>
       </w:r>
-      <w:proofErr w:type="spellStart"/>
       <w:r>
         <w:t>NoSuchBucket</w:t>
       </w:r>
-      <w:proofErr w:type="spellEnd"/>
       <w:r>
         <w:rPr>
           <w:rFonts w:hint="eastAsia"/>
@@ -9233,13 +8997,12 @@
         <w:rPr>
           <w:rFonts w:hint="eastAsia"/>
         </w:rPr>
+        <w:lastRenderedPageBreak/>
         <w:t>桶不属于自己，返回</w:t>
       </w:r>
-      <w:proofErr w:type="spellStart"/>
       <w:r>
         <w:t>AccessDenied</w:t>
       </w:r>
-      <w:proofErr w:type="spellEnd"/>
       <w:r>
         <w:rPr>
           <w:rFonts w:hint="eastAsia"/>
@@ -9299,11 +9062,9 @@
         </w:rPr>
         <w:t>，返回</w:t>
       </w:r>
-      <w:proofErr w:type="spellStart"/>
       <w:r>
         <w:t>InvalidVersioningStatus</w:t>
       </w:r>
-      <w:proofErr w:type="spellEnd"/>
       <w:r>
         <w:rPr>
           <w:rFonts w:hint="eastAsia"/>
@@ -9375,7 +9136,7 @@
                     </pic:cNvPicPr>
                   </pic:nvPicPr>
                   <pic:blipFill>
-                    <a:blip r:embed="rId14">
+                    <a:blip r:embed="rId15">
                       <a:extLst>
                         <a:ext uri="{28A0092B-C50C-407E-A947-70E740481C1C}">
                           <a14:useLocalDpi xmlns:a14="http://schemas.microsoft.com/office/drawing/2010/main" val="0"/>
@@ -9415,7 +9176,6 @@
         <w:rPr>
           <w:rFonts w:hint="eastAsia"/>
         </w:rPr>
-        <w:lastRenderedPageBreak/>
         <w:t>正常场景：</w:t>
       </w:r>
     </w:p>
@@ -9487,11 +9247,9 @@
         </w:rPr>
         <w:t>桶不存在，返回</w:t>
       </w:r>
-      <w:proofErr w:type="spellStart"/>
       <w:r>
         <w:t>NoSuchBucket</w:t>
       </w:r>
-      <w:proofErr w:type="spellEnd"/>
       <w:r>
         <w:rPr>
           <w:rFonts w:hint="eastAsia"/>
@@ -9515,11 +9273,9 @@
         </w:rPr>
         <w:t>桶不属于自己，返回</w:t>
       </w:r>
-      <w:proofErr w:type="spellStart"/>
       <w:r>
         <w:t>AccessDenied</w:t>
       </w:r>
-      <w:proofErr w:type="spellEnd"/>
       <w:r>
         <w:rPr>
           <w:rFonts w:hint="eastAsia"/>
@@ -10664,7 +10420,6 @@
                 <w:rFonts w:hint="eastAsia"/>
                 <w:b/>
               </w:rPr>
-              <w:lastRenderedPageBreak/>
               <w:t>用例编号</w:t>
             </w:r>
           </w:p>
@@ -10895,14 +10650,12 @@
               </w:rPr>
               <w:t>头部中的</w:t>
             </w:r>
-            <w:proofErr w:type="spellStart"/>
             <w:r>
               <w:rPr>
                 <w:rFonts w:hint="eastAsia"/>
               </w:rPr>
               <w:t>AccessKeyID</w:t>
             </w:r>
-            <w:proofErr w:type="spellEnd"/>
             <w:r>
               <w:rPr>
                 <w:rFonts w:hint="eastAsia"/>
@@ -10927,14 +10680,12 @@
               </w:rPr>
               <w:t>的</w:t>
             </w:r>
-            <w:proofErr w:type="spellStart"/>
             <w:r>
               <w:rPr>
                 <w:rFonts w:hint="eastAsia"/>
               </w:rPr>
               <w:t>AccessKeyID</w:t>
             </w:r>
-            <w:proofErr w:type="spellEnd"/>
             <w:r>
               <w:rPr>
                 <w:rFonts w:hint="eastAsia"/>
@@ -11503,6 +11254,7 @@
               <w:rPr>
                 <w:rFonts w:hint="eastAsia"/>
               </w:rPr>
+              <w:lastRenderedPageBreak/>
               <w:t>Story.SequoiaS</w:t>
             </w:r>
             <w:r>
@@ -11524,19 +11276,11 @@
             <w:pPr>
               <w:ind w:left="0"/>
             </w:pPr>
-            <w:proofErr w:type="gramStart"/>
-            <w:r>
-              <w:rPr>
-                <w:rFonts w:hint="eastAsia"/>
-              </w:rPr>
-              <w:t>桶名不</w:t>
-            </w:r>
-            <w:proofErr w:type="gramEnd"/>
-            <w:r>
-              <w:rPr>
-                <w:rFonts w:hint="eastAsia"/>
-              </w:rPr>
-              <w:t>符合规范</w:t>
+            <w:r>
+              <w:rPr>
+                <w:rFonts w:hint="eastAsia"/>
+              </w:rPr>
+              <w:t>桶名不符合规范</w:t>
             </w:r>
           </w:p>
         </w:tc>
@@ -11604,16 +11348,8 @@
               <w:rPr>
                 <w:rFonts w:hint="eastAsia"/>
               </w:rPr>
-              <w:t>创建一个桶，</w:t>
-            </w:r>
-            <w:proofErr w:type="gramStart"/>
-            <w:r>
-              <w:rPr>
-                <w:rFonts w:hint="eastAsia"/>
-              </w:rPr>
-              <w:t>桶名包含</w:t>
-            </w:r>
-            <w:proofErr w:type="gramEnd"/>
+              <w:t>创建一个桶，桶名包含</w:t>
+            </w:r>
             <w:r>
               <w:rPr>
                 <w:rFonts w:hint="eastAsia"/>
@@ -11801,19 +11537,11 @@
             <w:pPr>
               <w:ind w:left="0"/>
             </w:pPr>
-            <w:proofErr w:type="gramStart"/>
-            <w:r>
-              <w:rPr>
-                <w:rFonts w:hint="eastAsia"/>
-              </w:rPr>
-              <w:t>桶名包含</w:t>
-            </w:r>
-            <w:proofErr w:type="gramEnd"/>
-            <w:r>
-              <w:rPr>
-                <w:rFonts w:hint="eastAsia"/>
-              </w:rPr>
-              <w:t>特殊字符</w:t>
+            <w:r>
+              <w:rPr>
+                <w:rFonts w:hint="eastAsia"/>
+              </w:rPr>
+              <w:t>桶名包含特殊字符</w:t>
             </w:r>
           </w:p>
         </w:tc>
@@ -11881,16 +11609,8 @@
               <w:rPr>
                 <w:rFonts w:hint="eastAsia"/>
               </w:rPr>
-              <w:t>创建一个桶，</w:t>
-            </w:r>
-            <w:proofErr w:type="gramStart"/>
-            <w:r>
-              <w:rPr>
-                <w:rFonts w:hint="eastAsia"/>
-              </w:rPr>
-              <w:t>桶名为</w:t>
-            </w:r>
-            <w:proofErr w:type="gramEnd"/>
+              <w:t>创建一个桶，桶名为</w:t>
+            </w:r>
             <w:r>
               <w:rPr>
                 <w:rFonts w:hint="eastAsia"/>
@@ -11969,52 +11689,14 @@
               <w:rPr>
                 <w:rFonts w:hint="eastAsia"/>
               </w:rPr>
-              <w:t>创建一个桶，</w:t>
-            </w:r>
-            <w:proofErr w:type="gramStart"/>
-            <w:r>
-              <w:rPr>
-                <w:rFonts w:hint="eastAsia"/>
-              </w:rPr>
-              <w:t>桶名为</w:t>
-            </w:r>
-            <w:proofErr w:type="gramEnd"/>
-            <w:r>
-              <w:rPr>
-                <w:rFonts w:hint="eastAsia"/>
-              </w:rPr>
-              <w:t>ww.ww.ww.</w:t>
-            </w:r>
-            <w:proofErr w:type="gramStart"/>
-            <w:r>
-              <w:rPr>
-                <w:rFonts w:hint="eastAsia"/>
-              </w:rPr>
-              <w:t>ee.</w:t>
-            </w:r>
-            <w:proofErr w:type="spellStart"/>
-            <w:r>
-              <w:rPr>
-                <w:rFonts w:hint="eastAsia"/>
-              </w:rPr>
-              <w:t>rr</w:t>
-            </w:r>
-            <w:proofErr w:type="spellEnd"/>
-            <w:r>
-              <w:rPr>
-                <w:rFonts w:hint="eastAsia"/>
-              </w:rPr>
-              <w:t>..</w:t>
-            </w:r>
-            <w:proofErr w:type="spellStart"/>
-            <w:proofErr w:type="gramEnd"/>
-            <w:r>
-              <w:rPr>
-                <w:rFonts w:hint="eastAsia"/>
-              </w:rPr>
-              <w:t>dd</w:t>
-            </w:r>
-            <w:proofErr w:type="spellEnd"/>
+              <w:t>创建一个桶，桶名为</w:t>
+            </w:r>
+            <w:r>
+              <w:rPr>
+                <w:rFonts w:hint="eastAsia"/>
+              </w:rPr>
+              <w:t>ww.ww.ww.ee.rr..dd</w:t>
+            </w:r>
           </w:p>
           <w:p>
             <w:pPr>
@@ -12044,16 +11726,8 @@
               <w:rPr>
                 <w:rFonts w:hint="eastAsia"/>
               </w:rPr>
-              <w:t>创建一个桶，</w:t>
-            </w:r>
-            <w:proofErr w:type="gramStart"/>
-            <w:r>
-              <w:rPr>
-                <w:rFonts w:hint="eastAsia"/>
-              </w:rPr>
-              <w:t>桶名包含</w:t>
-            </w:r>
-            <w:proofErr w:type="gramEnd"/>
+              <w:t>创建一个桶，桶名包含</w:t>
+            </w:r>
             <w:r>
               <w:rPr>
                 <w:rFonts w:hint="eastAsia"/>
@@ -12157,30 +11831,8 @@
               <w:rPr>
                 <w:rFonts w:hint="eastAsia"/>
               </w:rPr>
-              <w:t>ww.ww.ww.ee.</w:t>
-            </w:r>
-            <w:proofErr w:type="spellStart"/>
-            <w:r>
-              <w:rPr>
-                <w:rFonts w:hint="eastAsia"/>
-              </w:rPr>
-              <w:t>rr</w:t>
-            </w:r>
-            <w:proofErr w:type="spellEnd"/>
-            <w:r>
-              <w:rPr>
-                <w:rFonts w:hint="eastAsia"/>
-              </w:rPr>
-              <w:t>..</w:t>
-            </w:r>
-            <w:proofErr w:type="spellStart"/>
-            <w:r>
-              <w:rPr>
-                <w:rFonts w:hint="eastAsia"/>
-              </w:rPr>
-              <w:t>dd</w:t>
-            </w:r>
-            <w:proofErr w:type="spellEnd"/>
+              <w:t>ww.ww.ww.ee.rr..dd</w:t>
+            </w:r>
             <w:r>
               <w:rPr>
                 <w:rFonts w:hint="eastAsia"/>
@@ -12214,7 +11866,6 @@
               <w:rPr>
                 <w:rFonts w:hint="eastAsia"/>
               </w:rPr>
-              <w:lastRenderedPageBreak/>
               <w:t>Story.SequoiaS</w:t>
             </w:r>
             <w:r>
@@ -12309,14 +11960,12 @@
               </w:rPr>
               <w:t>用户创建了桶</w:t>
             </w:r>
-            <w:proofErr w:type="spellStart"/>
             <w:r>
               <w:rPr>
                 <w:rFonts w:hint="eastAsia"/>
               </w:rPr>
               <w:t>mybucket</w:t>
             </w:r>
-            <w:proofErr w:type="spellEnd"/>
           </w:p>
           <w:p>
             <w:pPr>
@@ -12376,14 +12025,12 @@
             <w:r>
               <w:t xml:space="preserve"> </w:t>
             </w:r>
-            <w:proofErr w:type="spellStart"/>
             <w:r>
               <w:rPr>
                 <w:rFonts w:hint="eastAsia"/>
               </w:rPr>
               <w:t>Bucketversioning</w:t>
             </w:r>
-            <w:proofErr w:type="spellEnd"/>
             <w:r>
               <w:rPr>
                 <w:rFonts w:hint="eastAsia"/>
@@ -12434,14 +12081,12 @@
             <w:r>
               <w:t xml:space="preserve"> </w:t>
             </w:r>
-            <w:proofErr w:type="spellStart"/>
             <w:r>
               <w:rPr>
                 <w:rFonts w:hint="eastAsia"/>
               </w:rPr>
               <w:t>Bucketversioning</w:t>
             </w:r>
-            <w:proofErr w:type="spellEnd"/>
             <w:r>
               <w:rPr>
                 <w:rFonts w:hint="eastAsia"/>
@@ -12501,21 +12146,7 @@
               <w:rPr>
                 <w:i/>
               </w:rPr>
-              <w:t>&lt;</w:t>
-            </w:r>
-            <w:proofErr w:type="spellStart"/>
-            <w:r>
-              <w:rPr>
-                <w:i/>
-              </w:rPr>
-              <w:t>VersioningConfiguration</w:t>
-            </w:r>
-            <w:proofErr w:type="spellEnd"/>
-            <w:r>
-              <w:rPr>
-                <w:i/>
-              </w:rPr>
-              <w:t>/&gt;</w:t>
+              <w:t>&lt;VersioningConfiguration/&gt;</w:t>
             </w:r>
           </w:p>
           <w:p>
@@ -12623,6 +12254,7 @@
                 <w:rFonts w:hint="eastAsia"/>
                 <w:strike/>
               </w:rPr>
+              <w:lastRenderedPageBreak/>
               <w:t>Story.SequoiaS</w:t>
             </w:r>
             <w:r>
@@ -12745,7 +12377,6 @@
               </w:rPr>
               <w:t>用户创建了桶</w:t>
             </w:r>
-            <w:proofErr w:type="spellStart"/>
             <w:r>
               <w:rPr>
                 <w:rFonts w:hint="eastAsia"/>
@@ -12753,7 +12384,6 @@
               </w:rPr>
               <w:t>mybucket</w:t>
             </w:r>
-            <w:proofErr w:type="spellEnd"/>
           </w:p>
           <w:p>
             <w:pPr>
@@ -12807,7 +12437,6 @@
               </w:rPr>
               <w:t>查询</w:t>
             </w:r>
-            <w:proofErr w:type="spellStart"/>
             <w:r>
               <w:rPr>
                 <w:rFonts w:hint="eastAsia"/>
@@ -12815,7 +12444,6 @@
               </w:rPr>
               <w:t>mybucket</w:t>
             </w:r>
-            <w:proofErr w:type="spellEnd"/>
             <w:r>
               <w:rPr>
                 <w:rFonts w:hint="eastAsia"/>
@@ -12876,7 +12504,6 @@
               </w:rPr>
               <w:t>设置</w:t>
             </w:r>
-            <w:proofErr w:type="spellStart"/>
             <w:r>
               <w:rPr>
                 <w:rFonts w:hint="eastAsia"/>
@@ -12884,7 +12511,6 @@
               </w:rPr>
               <w:t>mybucket</w:t>
             </w:r>
-            <w:proofErr w:type="spellEnd"/>
             <w:r>
               <w:rPr>
                 <w:rFonts w:hint="eastAsia"/>
@@ -12959,7 +12585,6 @@
               </w:rPr>
               <w:t>查询</w:t>
             </w:r>
-            <w:proofErr w:type="spellStart"/>
             <w:r>
               <w:rPr>
                 <w:rFonts w:hint="eastAsia"/>
@@ -12967,7 +12592,6 @@
               </w:rPr>
               <w:t>mybucket</w:t>
             </w:r>
-            <w:proofErr w:type="spellEnd"/>
             <w:r>
               <w:rPr>
                 <w:rFonts w:hint="eastAsia"/>
@@ -13356,7 +12980,6 @@
               <w:rPr>
                 <w:rFonts w:hint="eastAsia"/>
               </w:rPr>
-              <w:lastRenderedPageBreak/>
               <w:t>资料是否变更</w:t>
             </w:r>
           </w:p>
@@ -13505,19 +13128,11 @@
             <w:pPr>
               <w:ind w:left="0"/>
             </w:pPr>
-            <w:proofErr w:type="spellStart"/>
-            <w:r>
-              <w:rPr>
-                <w:rFonts w:hint="eastAsia"/>
-              </w:rPr>
-              <w:t>sdb</w:t>
-            </w:r>
-            <w:proofErr w:type="spellEnd"/>
-            <w:r>
-              <w:rPr>
-                <w:rFonts w:hint="eastAsia"/>
-              </w:rPr>
-              <w:t xml:space="preserve"> shell</w:t>
+            <w:r>
+              <w:rPr>
+                <w:rFonts w:hint="eastAsia"/>
+              </w:rPr>
+              <w:t>sdb shell</w:t>
             </w:r>
             <w:r>
               <w:rPr>
@@ -13551,7 +13166,7 @@
     </w:tbl>
     <w:p/>
     <w:sectPr>
-      <w:footerReference w:type="default" r:id="rId15"/>
+      <w:footerReference w:type="default" r:id="rId16"/>
       <w:pgSz w:w="11906" w:h="16838"/>
       <w:pgMar w:top="1440" w:right="1800" w:bottom="1440" w:left="1800" w:header="851" w:footer="992" w:gutter="0"/>
       <w:cols w:space="425"/>
@@ -13605,9 +13220,6 @@
     <w:p>
       <w:pPr>
         <w:pStyle w:val="af0"/>
-        <w:rPr>
-          <w:rFonts w:hint="eastAsia"/>
-        </w:rPr>
       </w:pPr>
     </w:p>
   </w:comment>
@@ -13669,7 +13281,7 @@
             <w:noProof/>
             <w:lang w:val="zh-CN"/>
           </w:rPr>
-          <w:t>16</w:t>
+          <w:t>17</w:t>
         </w:r>
         <w:r>
           <w:fldChar w:fldCharType="end"/>
@@ -19060,7 +18672,7 @@
 </file>
 
 <file path=customXml/itemProps1.xml><?xml version="1.0" encoding="utf-8"?>
-<ds:datastoreItem xmlns:ds="http://schemas.openxmlformats.org/officeDocument/2006/customXml" ds:itemID="{381FD16B-DCAF-4292-8DE4-8C59FC74D288}">
+<ds:datastoreItem xmlns:ds="http://schemas.openxmlformats.org/officeDocument/2006/customXml" ds:itemID="{CD072173-5D38-44C0-845D-BBBD140B4FFB}">
   <ds:schemaRefs>
     <ds:schemaRef ds:uri="http://schemas.openxmlformats.org/officeDocument/2006/bibliography"/>
   </ds:schemaRefs>

</xml_diff>